<commit_message>
added changes to syllabus
</commit_message>
<xml_diff>
--- a/Ramapo620-50_syllabus1.1docx.docx
+++ b/Ramapo620-50_syllabus1.1docx.docx
@@ -63,7 +63,6 @@
         </w:rPr>
         <w:t xml:space="preserve">0 - </w:t>
       </w:r>
-      <w:proofErr w:type="gramStart"/>
       <w:r>
         <w:rPr>
           <w:rFonts w:ascii="Arial" w:hAnsi="Arial" w:cs="Arial"/>
@@ -76,15 +75,7 @@
           <w:rFonts w:ascii="Arial" w:hAnsi="Arial" w:cs="Arial"/>
           <w:color w:val="000000" w:themeColor="text1"/>
         </w:rPr>
-        <w:t>0 :</w:t>
-      </w:r>
-      <w:proofErr w:type="gramEnd"/>
-      <w:r>
-        <w:rPr>
-          <w:rFonts w:ascii="Arial" w:hAnsi="Arial" w:cs="Arial"/>
-          <w:color w:val="000000" w:themeColor="text1"/>
-        </w:rPr>
-        <w:t xml:space="preserve"> </w:t>
+        <w:t xml:space="preserve">0 : </w:t>
       </w:r>
       <w:r>
         <w:rPr>
@@ -389,23 +380,7 @@
           <w:rFonts w:ascii="Arial" w:hAnsi="Arial" w:cs="Arial"/>
           <w:color w:val="000000" w:themeColor="text1"/>
         </w:rPr>
-        <w:t xml:space="preserve">This course provides a foundational introduction to music programming languages. </w:t>
-      </w:r>
-      <w:proofErr w:type="spellStart"/>
-      <w:r>
-        <w:rPr>
-          <w:rFonts w:ascii="Arial" w:hAnsi="Arial" w:cs="Arial"/>
-          <w:color w:val="000000" w:themeColor="text1"/>
-        </w:rPr>
-        <w:t>SuperCollider</w:t>
-      </w:r>
-      <w:proofErr w:type="spellEnd"/>
-      <w:r>
-        <w:rPr>
-          <w:rFonts w:ascii="Arial" w:hAnsi="Arial" w:cs="Arial"/>
-          <w:color w:val="000000" w:themeColor="text1"/>
-        </w:rPr>
-        <w:t xml:space="preserve">, </w:t>
+        <w:t xml:space="preserve">This course provides a foundational introduction to music programming languages. SuperCollider, </w:t>
       </w:r>
       <w:r>
         <w:rPr>
@@ -1160,7 +1135,6 @@
           <w:color w:val="000000"/>
         </w:rPr>
       </w:pPr>
-      <w:proofErr w:type="spellStart"/>
       <w:r>
         <w:rPr>
           <w:rFonts w:ascii="Arial" w:hAnsi="Arial" w:cs="Arial"/>
@@ -1168,48 +1142,27 @@
           <w:iCs/>
           <w:color w:val="000000"/>
         </w:rPr>
-        <w:t>collection:"Tutorials</w:t>
-      </w:r>
-      <w:proofErr w:type="spellEnd"/>
-      <w:r>
+        <w:t>collection:"Tutorials/Max Tutorials@cycling74"</w:t>
+      </w:r>
+    </w:p>
+    <w:p>
+      <w:pPr>
+        <w:ind w:left="2160"/>
         <w:rPr>
           <w:rFonts w:ascii="Arial" w:hAnsi="Arial" w:cs="Arial"/>
           <w:b/>
           <w:iCs/>
           <w:color w:val="000000"/>
         </w:rPr>
-        <w:t>/Max Tutorials@cycling74"</w:t>
-      </w:r>
-    </w:p>
-    <w:p>
-      <w:pPr>
-        <w:ind w:left="2160"/>
+      </w:pPr>
+      <w:r>
         <w:rPr>
           <w:rFonts w:ascii="Arial" w:hAnsi="Arial" w:cs="Arial"/>
           <w:b/>
           <w:iCs/>
           <w:color w:val="000000"/>
         </w:rPr>
-      </w:pPr>
-      <w:proofErr w:type="spellStart"/>
-      <w:r>
-        <w:rPr>
-          <w:rFonts w:ascii="Arial" w:hAnsi="Arial" w:cs="Arial"/>
-          <w:b/>
-          <w:iCs/>
-          <w:color w:val="000000"/>
-        </w:rPr>
-        <w:t>collection:"Tutorials</w:t>
-      </w:r>
-      <w:proofErr w:type="spellEnd"/>
-      <w:r>
-        <w:rPr>
-          <w:rFonts w:ascii="Arial" w:hAnsi="Arial" w:cs="Arial"/>
-          <w:b/>
-          <w:iCs/>
-          <w:color w:val="000000"/>
-        </w:rPr>
-        <w:t>/MSP Tutorials@cycling74"</w:t>
+        <w:t>collection:"Tutorials/MSP Tutorials@cycling74"</w:t>
       </w:r>
     </w:p>
     <w:p>
@@ -1397,23 +1350,7 @@
           <w:rFonts w:ascii="Arial" w:hAnsi="Arial" w:cs="Arial"/>
           <w:color w:val="000000" w:themeColor="text1"/>
         </w:rPr>
-        <w:t xml:space="preserve">Extremely powerful </w:t>
-      </w:r>
-      <w:proofErr w:type="gramStart"/>
-      <w:r>
-        <w:rPr>
-          <w:rFonts w:ascii="Arial" w:hAnsi="Arial" w:cs="Arial"/>
-          <w:color w:val="000000" w:themeColor="text1"/>
-        </w:rPr>
-        <w:t>code based</w:t>
-      </w:r>
-      <w:proofErr w:type="gramEnd"/>
-      <w:r>
-        <w:rPr>
-          <w:rFonts w:ascii="Arial" w:hAnsi="Arial" w:cs="Arial"/>
-          <w:color w:val="000000" w:themeColor="text1"/>
-        </w:rPr>
-        <w:t xml:space="preserve"> platform</w:t>
+        <w:t>Extremely powerful code based platform</w:t>
       </w:r>
     </w:p>
     <w:p>
@@ -1584,17 +1521,8 @@
           <w:rFonts w:ascii="Arial" w:hAnsi="Arial" w:cs="Arial"/>
           <w:color w:val="000000" w:themeColor="text1"/>
         </w:rPr>
-        <w:t xml:space="preserve">Daisy </w:t>
-      </w:r>
-      <w:proofErr w:type="spellStart"/>
-      <w:r>
-        <w:rPr>
-          <w:rFonts w:ascii="Arial" w:hAnsi="Arial" w:cs="Arial"/>
-          <w:color w:val="000000" w:themeColor="text1"/>
-        </w:rPr>
-        <w:t>ElectroSmith</w:t>
-      </w:r>
-      <w:proofErr w:type="spellEnd"/>
+        <w:t>Daisy ElectroSmith</w:t>
+      </w:r>
     </w:p>
     <w:p>
       <w:pPr>
@@ -1662,27 +1590,7 @@
           <w:color w:val="000000" w:themeColor="text1"/>
         </w:rPr>
         <w:lastRenderedPageBreak/>
-        <w:t xml:space="preserve">“Daisy is an embedded platform for music. It features everything you need for creating high fidelity audio hardware devices. Just plug in a USB cable and start making sound! Programming the Daisy is a breeze with support for </w:t>
-      </w:r>
-      <w:proofErr w:type="gramStart"/>
-      <w:r>
-        <w:rPr>
-          <w:rFonts w:ascii="Arial" w:hAnsi="Arial" w:cs="Arial"/>
-          <w:i/>
-          <w:iCs/>
-          <w:color w:val="000000" w:themeColor="text1"/>
-        </w:rPr>
-        <w:t>a number of</w:t>
-      </w:r>
-      <w:proofErr w:type="gramEnd"/>
-      <w:r>
-        <w:rPr>
-          <w:rFonts w:ascii="Arial" w:hAnsi="Arial" w:cs="Arial"/>
-          <w:i/>
-          <w:iCs/>
-          <w:color w:val="000000" w:themeColor="text1"/>
-        </w:rPr>
-        <w:t xml:space="preserve"> languages including C++, Arduino, and Max/MSP Gen~. To get started, simply upload an example program over USB, and start tweaking!”</w:t>
+        <w:t>“Daisy is an embedded platform for music. It features everything you need for creating high fidelity audio hardware devices. Just plug in a USB cable and start making sound! Programming the Daisy is a breeze with support for a number of languages including C++, Arduino, and Max/MSP Gen~. To get started, simply upload an example program over USB, and start tweaking!”</w:t>
       </w:r>
     </w:p>
     <w:p>
@@ -1788,25 +1696,8 @@
           <w:rFonts w:ascii="Arial" w:hAnsi="Arial" w:cs="Arial"/>
           <w:color w:val="000000" w:themeColor="text1"/>
         </w:rPr>
-        <w:t xml:space="preserve">Since this is a coding class, we use Git for version tracking. I am </w:t>
-      </w:r>
-      <w:proofErr w:type="spellStart"/>
-      <w:r>
-        <w:rPr>
-          <w:rFonts w:ascii="Arial" w:hAnsi="Arial" w:cs="Arial"/>
-          <w:color w:val="000000" w:themeColor="text1"/>
-        </w:rPr>
-        <w:t>constanting</w:t>
-      </w:r>
-      <w:proofErr w:type="spellEnd"/>
-      <w:r>
-        <w:rPr>
-          <w:rFonts w:ascii="Arial" w:hAnsi="Arial" w:cs="Arial"/>
-          <w:color w:val="000000" w:themeColor="text1"/>
-        </w:rPr>
-        <w:t xml:space="preserve"> updating, refining, refactoring, and revising code bases throughout the semester and many times throughout the week. Please learn to use </w:t>
-      </w:r>
-      <w:proofErr w:type="spellStart"/>
+        <w:t xml:space="preserve">Since this is a coding class, we use Git for version tracking. I am constanting updating, refining, refactoring, and revising code bases throughout the semester and many times throughout the week. Please learn to use </w:t>
+      </w:r>
       <w:r>
         <w:rPr>
           <w:rFonts w:ascii="Arial" w:hAnsi="Arial" w:cs="Arial"/>
@@ -1816,7 +1707,6 @@
         </w:rPr>
         <w:t>Github</w:t>
       </w:r>
-      <w:proofErr w:type="spellEnd"/>
       <w:r>
         <w:rPr>
           <w:rFonts w:ascii="Arial" w:hAnsi="Arial" w:cs="Arial"/>
@@ -1831,23 +1721,7 @@
           <w:rFonts w:ascii="Arial" w:hAnsi="Arial" w:cs="Arial"/>
           <w:color w:val="000000" w:themeColor="text1"/>
         </w:rPr>
-        <w:t xml:space="preserve">Download </w:t>
-      </w:r>
-      <w:proofErr w:type="spellStart"/>
-      <w:r>
-        <w:rPr>
-          <w:rFonts w:ascii="Arial" w:hAnsi="Arial" w:cs="Arial"/>
-          <w:color w:val="000000" w:themeColor="text1"/>
-        </w:rPr>
-        <w:t>Github</w:t>
-      </w:r>
-      <w:proofErr w:type="spellEnd"/>
-      <w:r>
-        <w:rPr>
-          <w:rFonts w:ascii="Arial" w:hAnsi="Arial" w:cs="Arial"/>
-          <w:color w:val="000000" w:themeColor="text1"/>
-        </w:rPr>
-        <w:t xml:space="preserve"> Desktop and make an account asap.</w:t>
+        <w:t>Download Github Desktop and make an account asap.</w:t>
       </w:r>
     </w:p>
     <w:p>
@@ -2002,95 +1876,7 @@
           <w:sz w:val="28"/>
           <w:szCs w:val="28"/>
         </w:rPr>
-        <w:t xml:space="preserve"> Download </w:t>
-      </w:r>
-      <w:proofErr w:type="spellStart"/>
-      <w:r>
-        <w:rPr>
-          <w:i w:val="0"/>
-          <w:iCs w:val="0"/>
-          <w:color w:val="000000" w:themeColor="text1"/>
-          <w:sz w:val="28"/>
-          <w:szCs w:val="28"/>
-        </w:rPr>
-        <w:t>Github</w:t>
-      </w:r>
-      <w:proofErr w:type="spellEnd"/>
-      <w:r>
-        <w:rPr>
-          <w:i w:val="0"/>
-          <w:iCs w:val="0"/>
-          <w:color w:val="000000" w:themeColor="text1"/>
-          <w:sz w:val="28"/>
-          <w:szCs w:val="28"/>
-        </w:rPr>
-        <w:t xml:space="preserve"> desktop, </w:t>
-      </w:r>
-      <w:proofErr w:type="gramStart"/>
-      <w:r>
-        <w:rPr>
-          <w:i w:val="0"/>
-          <w:iCs w:val="0"/>
-          <w:color w:val="000000" w:themeColor="text1"/>
-          <w:sz w:val="28"/>
-          <w:szCs w:val="28"/>
-        </w:rPr>
-        <w:t>Go</w:t>
-      </w:r>
-      <w:proofErr w:type="gramEnd"/>
-      <w:r>
-        <w:rPr>
-          <w:i w:val="0"/>
-          <w:iCs w:val="0"/>
-          <w:color w:val="000000" w:themeColor="text1"/>
-          <w:sz w:val="28"/>
-          <w:szCs w:val="28"/>
-        </w:rPr>
-        <w:t xml:space="preserve"> to the link above, and click "open with </w:t>
-      </w:r>
-      <w:proofErr w:type="spellStart"/>
-      <w:r>
-        <w:rPr>
-          <w:i w:val="0"/>
-          <w:iCs w:val="0"/>
-          <w:color w:val="000000" w:themeColor="text1"/>
-          <w:sz w:val="28"/>
-          <w:szCs w:val="28"/>
-        </w:rPr>
-        <w:t>github</w:t>
-      </w:r>
-      <w:proofErr w:type="spellEnd"/>
-      <w:r>
-        <w:rPr>
-          <w:i w:val="0"/>
-          <w:iCs w:val="0"/>
-          <w:color w:val="000000" w:themeColor="text1"/>
-          <w:sz w:val="28"/>
-          <w:szCs w:val="28"/>
-        </w:rPr>
-        <w:t xml:space="preserve"> desktop". It will automatically download the class repository locally. You must check this every </w:t>
-      </w:r>
-      <w:proofErr w:type="gramStart"/>
-      <w:r>
-        <w:rPr>
-          <w:i w:val="0"/>
-          <w:iCs w:val="0"/>
-          <w:color w:val="000000" w:themeColor="text1"/>
-          <w:sz w:val="28"/>
-          <w:szCs w:val="28"/>
-        </w:rPr>
-        <w:t>week, and</w:t>
-      </w:r>
-      <w:proofErr w:type="gramEnd"/>
-      <w:r>
-        <w:rPr>
-          <w:i w:val="0"/>
-          <w:iCs w:val="0"/>
-          <w:color w:val="000000" w:themeColor="text1"/>
-          <w:sz w:val="28"/>
-          <w:szCs w:val="28"/>
-        </w:rPr>
-        <w:t xml:space="preserve"> see if I have pushed any changes.</w:t>
+        <w:t xml:space="preserve"> Download Github desktop, Go to the link above, and click "open with github desktop". It will automatically download the class repository locally. You must check this every week, and see if I have pushed any changes.</w:t>
       </w:r>
     </w:p>
     <w:p>
@@ -2156,16 +1942,8 @@
         <w:rPr>
           <w:rFonts w:ascii="Arial" w:hAnsi="Arial" w:cs="Arial"/>
         </w:rPr>
-        <w:t xml:space="preserve">● Production Techniques: evaluate and apply advanced techniques in music production, synthesis, recording, programming, editing, and </w:t>
-      </w:r>
-      <w:proofErr w:type="gramStart"/>
-      <w:r>
-        <w:rPr>
-          <w:rFonts w:ascii="Arial" w:hAnsi="Arial" w:cs="Arial"/>
-        </w:rPr>
-        <w:t>mastering;</w:t>
-      </w:r>
-      <w:proofErr w:type="gramEnd"/>
+        <w:t>● Production Techniques: evaluate and apply advanced techniques in music production, synthesis, recording, programming, editing, and mastering;</w:t>
+      </w:r>
     </w:p>
     <w:p>
       <w:pPr>
@@ -2189,16 +1967,8 @@
         <w:rPr>
           <w:rFonts w:ascii="Arial" w:hAnsi="Arial" w:cs="Arial"/>
         </w:rPr>
-        <w:t xml:space="preserve">Theoretical Foundations: identify and interpret core theoretical foundations of </w:t>
-      </w:r>
-      <w:proofErr w:type="gramStart"/>
-      <w:r>
-        <w:rPr>
-          <w:rFonts w:ascii="Arial" w:hAnsi="Arial" w:cs="Arial"/>
-        </w:rPr>
-        <w:t>audio;</w:t>
-      </w:r>
-      <w:proofErr w:type="gramEnd"/>
+        <w:t>Theoretical Foundations: identify and interpret core theoretical foundations of audio;</w:t>
+      </w:r>
     </w:p>
     <w:p>
       <w:pPr>
@@ -2223,16 +1993,8 @@
         <w:rPr>
           <w:rFonts w:ascii="Arial" w:hAnsi="Arial" w:cs="Arial"/>
         </w:rPr>
-        <w:t xml:space="preserve">Context: analyze and articulate the importance of context in diverse practices within music </w:t>
-      </w:r>
-      <w:proofErr w:type="gramStart"/>
-      <w:r>
-        <w:rPr>
-          <w:rFonts w:ascii="Arial" w:hAnsi="Arial" w:cs="Arial"/>
-        </w:rPr>
-        <w:t>technology;</w:t>
-      </w:r>
-      <w:proofErr w:type="gramEnd"/>
+        <w:t>Context: analyze and articulate the importance of context in diverse practices within music technology;</w:t>
+      </w:r>
     </w:p>
     <w:p>
       <w:pPr>
@@ -2256,16 +2018,8 @@
         <w:rPr>
           <w:rFonts w:ascii="Arial" w:hAnsi="Arial" w:cs="Arial"/>
         </w:rPr>
-        <w:t xml:space="preserve">Musicianship and Production: integrate traditional, non-Western, and experimental approaches to musicianship and composition with music production </w:t>
-      </w:r>
-      <w:proofErr w:type="gramStart"/>
-      <w:r>
-        <w:rPr>
-          <w:rFonts w:ascii="Arial" w:hAnsi="Arial" w:cs="Arial"/>
-        </w:rPr>
-        <w:t>skills;</w:t>
-      </w:r>
-      <w:proofErr w:type="gramEnd"/>
+        <w:t>Musicianship and Production: integrate traditional, non-Western, and experimental approaches to musicianship and composition with music production skills;</w:t>
+      </w:r>
     </w:p>
     <w:p>
       <w:pPr>
@@ -2427,21 +2181,7 @@
         <w:rPr>
           <w:rFonts w:ascii="Arial" w:hAnsi="Arial" w:cs="Arial"/>
         </w:rPr>
-        <w:t xml:space="preserve">Demonstrate the ability to create programs in </w:t>
-      </w:r>
-      <w:proofErr w:type="spellStart"/>
-      <w:r>
-        <w:rPr>
-          <w:rFonts w:ascii="Arial" w:hAnsi="Arial" w:cs="Arial"/>
-        </w:rPr>
-        <w:t>SuperCollider</w:t>
-      </w:r>
-      <w:proofErr w:type="spellEnd"/>
-      <w:r>
-        <w:rPr>
-          <w:rFonts w:ascii="Arial" w:hAnsi="Arial" w:cs="Arial"/>
-        </w:rPr>
-        <w:t>, Python, Processing and C++ in the production of compositions an</w:t>
+        <w:t>Demonstrate the ability to create programs in SuperCollider, Python, Processing and C++ in the production of compositions an</w:t>
       </w:r>
       <w:r>
         <w:rPr>
@@ -2472,21 +2212,7 @@
         <w:rPr>
           <w:rFonts w:ascii="Arial" w:hAnsi="Arial" w:cs="Arial"/>
         </w:rPr>
-        <w:t xml:space="preserve">Understand the fundamentals of computer programming languages for music and be able to implement them to build original Audio Unit &amp; </w:t>
-      </w:r>
-      <w:proofErr w:type="spellStart"/>
-      <w:r>
-        <w:rPr>
-          <w:rFonts w:ascii="Arial" w:hAnsi="Arial" w:cs="Arial"/>
-        </w:rPr>
-        <w:t>VSTplugins</w:t>
-      </w:r>
-      <w:proofErr w:type="spellEnd"/>
-      <w:r>
-        <w:rPr>
-          <w:rFonts w:ascii="Arial" w:hAnsi="Arial" w:cs="Arial"/>
-        </w:rPr>
-        <w:t xml:space="preserve"> (Projects)</w:t>
+        <w:t>Understand the fundamentals of computer programming languages for music and be able to implement them to build original Audio Unit &amp; VSTplugins (Projects)</w:t>
       </w:r>
     </w:p>
     <w:p>
@@ -3012,25 +2738,7 @@
           <w:sz w:val="24"/>
           <w:szCs w:val="24"/>
         </w:rPr>
-        <w:t xml:space="preserve"> work and experiment in class. Discussions, critiques lectures and demonstrations provide the basis for the successful completion of projects, and they are difficult to re-create outside of class. </w:t>
-      </w:r>
-      <w:proofErr w:type="gramStart"/>
-      <w:r>
-        <w:rPr>
-          <w:color w:val="000000" w:themeColor="text1"/>
-          <w:sz w:val="24"/>
-          <w:szCs w:val="24"/>
-        </w:rPr>
-        <w:t>In order to</w:t>
-      </w:r>
-      <w:proofErr w:type="gramEnd"/>
-      <w:r>
-        <w:rPr>
-          <w:color w:val="000000" w:themeColor="text1"/>
-          <w:sz w:val="24"/>
-          <w:szCs w:val="24"/>
-        </w:rPr>
-        <w:t xml:space="preserve"> participate, you must be in attendance. </w:t>
+        <w:t xml:space="preserve"> work and experiment in class. Discussions, critiques lectures and demonstrations provide the basis for the successful completion of projects, and they are difficult to re-create outside of class. In order to participate, you must be in attendance. </w:t>
       </w:r>
     </w:p>
     <w:p>
@@ -3350,18 +3058,8 @@
           <w:sz w:val="24"/>
           <w:szCs w:val="24"/>
         </w:rPr>
-        <w:t xml:space="preserve">catch </w:t>
-      </w:r>
-      <w:proofErr w:type="gramStart"/>
-      <w:r>
-        <w:rPr>
-          <w:color w:val="000000" w:themeColor="text1"/>
-          <w:sz w:val="24"/>
-          <w:szCs w:val="24"/>
-        </w:rPr>
-        <w:t>up!—</w:t>
-      </w:r>
-      <w:proofErr w:type="gramEnd"/>
+        <w:t>catch up!—</w:t>
+      </w:r>
       <w:r>
         <w:rPr>
           <w:color w:val="000000" w:themeColor="text1"/>
@@ -3612,25 +3310,7 @@
           <w:sz w:val="24"/>
           <w:szCs w:val="24"/>
         </w:rPr>
-        <w:t xml:space="preserve">You </w:t>
-      </w:r>
-      <w:proofErr w:type="gramStart"/>
-      <w:r>
-        <w:rPr>
-          <w:color w:val="000000" w:themeColor="text1"/>
-          <w:sz w:val="24"/>
-          <w:szCs w:val="24"/>
-        </w:rPr>
-        <w:t>have to</w:t>
-      </w:r>
-      <w:proofErr w:type="gramEnd"/>
-      <w:r>
-        <w:rPr>
-          <w:color w:val="000000" w:themeColor="text1"/>
-          <w:sz w:val="24"/>
-          <w:szCs w:val="24"/>
-        </w:rPr>
-        <w:t xml:space="preserve"> identify and explain a technological process.</w:t>
+        <w:t>You have to identify and explain a technological process.</w:t>
       </w:r>
     </w:p>
     <w:p>
@@ -3649,25 +3329,7 @@
           <w:sz w:val="24"/>
           <w:szCs w:val="24"/>
         </w:rPr>
-        <w:t xml:space="preserve">It should be appropriately cited, referenced. You should not just link to </w:t>
-      </w:r>
-      <w:proofErr w:type="spellStart"/>
-      <w:r>
-        <w:rPr>
-          <w:color w:val="000000" w:themeColor="text1"/>
-          <w:sz w:val="24"/>
-          <w:szCs w:val="24"/>
-        </w:rPr>
-        <w:t>Youtube</w:t>
-      </w:r>
-      <w:proofErr w:type="spellEnd"/>
-      <w:r>
-        <w:rPr>
-          <w:color w:val="000000" w:themeColor="text1"/>
-          <w:sz w:val="24"/>
-          <w:szCs w:val="24"/>
-        </w:rPr>
-        <w:t xml:space="preserve"> videos and let the video do the talking.</w:t>
+        <w:t>It should be appropriately cited, referenced. You should not just link to Youtube videos and let the video do the talking.</w:t>
       </w:r>
     </w:p>
     <w:p>
@@ -4019,69 +3681,27 @@
         <w:rPr>
           <w:rFonts w:ascii="Arial" w:hAnsi="Arial" w:cs="Arial"/>
         </w:rPr>
-        <w:t xml:space="preserve">The use of Machine Learning tools such as ChatGPT and Claude are permitted, generally. In some </w:t>
-      </w:r>
-      <w:proofErr w:type="gramStart"/>
-      <w:r>
-        <w:rPr>
-          <w:rFonts w:ascii="Arial" w:hAnsi="Arial" w:cs="Arial"/>
-        </w:rPr>
-        <w:t>cases</w:t>
-      </w:r>
-      <w:proofErr w:type="gramEnd"/>
-      <w:r>
-        <w:rPr>
-          <w:rFonts w:ascii="Arial" w:hAnsi="Arial" w:cs="Arial"/>
-        </w:rPr>
-        <w:t xml:space="preserve"> we will explore them deliberately. In some </w:t>
-      </w:r>
-      <w:proofErr w:type="gramStart"/>
-      <w:r>
-        <w:rPr>
-          <w:rFonts w:ascii="Arial" w:hAnsi="Arial" w:cs="Arial"/>
-        </w:rPr>
-        <w:t>instances</w:t>
-      </w:r>
-      <w:proofErr w:type="gramEnd"/>
-      <w:r>
-        <w:rPr>
-          <w:rFonts w:ascii="Arial" w:hAnsi="Arial" w:cs="Arial"/>
-        </w:rPr>
-        <w:t xml:space="preserve"> you will be discouraged from using these tools. AI represents a sea change for humanity. It also represents a paradigm shift for pedagogy in digital literacy.  </w:t>
-      </w:r>
-    </w:p>
-    <w:p>
-      <w:pPr>
-        <w:rPr>
-          <w:rFonts w:ascii="Arial" w:hAnsi="Arial" w:cs="Arial"/>
-        </w:rPr>
-      </w:pPr>
-    </w:p>
-    <w:p>
-      <w:pPr>
-        <w:rPr>
-          <w:rFonts w:ascii="Arial" w:hAnsi="Arial" w:cs="Arial"/>
-        </w:rPr>
-      </w:pPr>
-      <w:r>
-        <w:rPr>
-          <w:rFonts w:ascii="Arial" w:hAnsi="Arial" w:cs="Arial"/>
-        </w:rPr>
-        <w:t xml:space="preserve">I expect you will want to use AI (ChatGPT and image generation tools, at a minimum), in this class. In fact, some assignments will require it. Learning to use AI is an emerging skill—be aware of its limits. If you provide minimum effort prompts, you will get low quality results. You will need to refine your prompts </w:t>
-      </w:r>
-      <w:proofErr w:type="gramStart"/>
-      <w:r>
-        <w:rPr>
-          <w:rFonts w:ascii="Arial" w:hAnsi="Arial" w:cs="Arial"/>
-        </w:rPr>
-        <w:t>in order to</w:t>
-      </w:r>
-      <w:proofErr w:type="gramEnd"/>
-      <w:r>
-        <w:rPr>
-          <w:rFonts w:ascii="Arial" w:hAnsi="Arial" w:cs="Arial"/>
-        </w:rPr>
-        <w:t xml:space="preserve"> get good outcomes. This will take work.</w:t>
+        <w:t xml:space="preserve">The use of Machine Learning tools such as ChatGPT and Claude are permitted, generally. In some cases we will explore them deliberately. In some instances you will be discouraged from using these tools. AI represents a sea change for humanity. It also represents a paradigm shift for pedagogy in digital literacy.  </w:t>
+      </w:r>
+    </w:p>
+    <w:p>
+      <w:pPr>
+        <w:rPr>
+          <w:rFonts w:ascii="Arial" w:hAnsi="Arial" w:cs="Arial"/>
+        </w:rPr>
+      </w:pPr>
+    </w:p>
+    <w:p>
+      <w:pPr>
+        <w:rPr>
+          <w:rFonts w:ascii="Arial" w:hAnsi="Arial" w:cs="Arial"/>
+        </w:rPr>
+      </w:pPr>
+      <w:r>
+        <w:rPr>
+          <w:rFonts w:ascii="Arial" w:hAnsi="Arial" w:cs="Arial"/>
+        </w:rPr>
+        <w:t>I expect you will want to use AI (ChatGPT and image generation tools, at a minimum), in this class. In fact, some assignments will require it. Learning to use AI is an emerging skill—be aware of its limits. If you provide minimum effort prompts, you will get low quality results. You will need to refine your prompts in order to get good outcomes. This will take work.</w:t>
       </w:r>
     </w:p>
     <w:p>
@@ -4164,146 +3784,114 @@
           <w:rFonts w:ascii="Arial" w:hAnsi="Arial" w:cs="Arial"/>
           <w:color w:val="141414"/>
         </w:rPr>
-        <w:t xml:space="preserve">Ramapo College is committed to fostering a safe, productive learning environment. Title IX and our college policy prohibit discrimination </w:t>
-      </w:r>
-      <w:proofErr w:type="gramStart"/>
-      <w:r>
+        <w:t xml:space="preserve">Ramapo College is committed to fostering a safe, productive learning environment. Title IX and our college policy prohibit discrimination on the basis of sex or gender. Sexual misconduct — including harassment, domestic and dating violence, sexual assault, and stalking are prohibited. The College encourages anyone experiencing sexual misconduct to talk to someone about what happened, so they can get the support they need and our college can respond appropriately. </w:t>
+      </w:r>
+    </w:p>
+    <w:p>
+      <w:pPr>
+        <w:rPr>
+          <w:rFonts w:ascii="Arial" w:hAnsi="Arial" w:cs="Arial"/>
+        </w:rPr>
+      </w:pPr>
+    </w:p>
+    <w:p>
+      <w:pPr>
         <w:rPr>
           <w:rFonts w:ascii="Arial" w:hAnsi="Arial" w:cs="Arial"/>
           <w:color w:val="141414"/>
         </w:rPr>
-        <w:t>on the basis of</w:t>
-      </w:r>
-      <w:proofErr w:type="gramEnd"/>
+      </w:pPr>
       <w:r>
         <w:rPr>
           <w:rFonts w:ascii="Arial" w:hAnsi="Arial" w:cs="Arial"/>
           <w:color w:val="141414"/>
         </w:rPr>
-        <w:t xml:space="preserve"> sex or gender. Sexual misconduct — including harassment, domestic and dating violence, sexual assault, and stalking are prohibited. The College encourages anyone experiencing sexual misconduct to talk to someone about what happened, so they can get the support they need and our college can respond appropriately. </w:t>
-      </w:r>
-    </w:p>
-    <w:p>
-      <w:pPr>
-        <w:rPr>
-          <w:rFonts w:ascii="Arial" w:hAnsi="Arial" w:cs="Arial"/>
-        </w:rPr>
-      </w:pPr>
-    </w:p>
-    <w:p>
-      <w:pPr>
+        <w:t xml:space="preserve">If you wish to speak confidentially about an incident of sexual misconduct, please contact the Counseling Center at </w:t>
+      </w:r>
+      <w:r>
+        <w:rPr>
+          <w:rFonts w:ascii="Arial" w:hAnsi="Arial" w:cs="Arial"/>
+          <w:color w:val="0E24B2"/>
+        </w:rPr>
+        <w:t xml:space="preserve">201-684-7522 </w:t>
+      </w:r>
+      <w:r>
         <w:rPr>
           <w:rFonts w:ascii="Arial" w:hAnsi="Arial" w:cs="Arial"/>
           <w:color w:val="141414"/>
         </w:rPr>
-      </w:pPr>
+        <w:t xml:space="preserve">or </w:t>
+      </w:r>
+      <w:r>
+        <w:rPr>
+          <w:rFonts w:ascii="Arial" w:hAnsi="Arial" w:cs="Arial"/>
+          <w:color w:val="0E24B2"/>
+        </w:rPr>
+        <w:t xml:space="preserve">201-684-6666 </w:t>
+      </w:r>
       <w:r>
         <w:rPr>
           <w:rFonts w:ascii="Arial" w:hAnsi="Arial" w:cs="Arial"/>
           <w:color w:val="141414"/>
         </w:rPr>
-        <w:t xml:space="preserve">If you wish to speak confidentially about an incident of sexual misconduct, please contact the Counseling Center at </w:t>
+        <w:t xml:space="preserve">during nights and weekends. If you wish to report sexual misconduct or have questions about policies and procedures regarding sexual misconduct, please contact the College’s Title IX Coordinator at </w:t>
       </w:r>
       <w:r>
         <w:rPr>
           <w:rFonts w:ascii="Arial" w:hAnsi="Arial" w:cs="Arial"/>
           <w:color w:val="0E24B2"/>
         </w:rPr>
-        <w:t xml:space="preserve">201-684-7522 </w:t>
+        <w:t>201-684-7540</w:t>
       </w:r>
       <w:r>
         <w:rPr>
           <w:rFonts w:ascii="Arial" w:hAnsi="Arial" w:cs="Arial"/>
           <w:color w:val="141414"/>
         </w:rPr>
-        <w:t xml:space="preserve">or </w:t>
-      </w:r>
-      <w:r>
-        <w:rPr>
-          <w:rFonts w:ascii="Arial" w:hAnsi="Arial" w:cs="Arial"/>
-          <w:color w:val="0E24B2"/>
-        </w:rPr>
-        <w:t xml:space="preserve">201-684-6666 </w:t>
-      </w:r>
+        <w:t xml:space="preserve">. </w:t>
+      </w:r>
+    </w:p>
+    <w:p>
+      <w:pPr>
+        <w:rPr>
+          <w:rFonts w:ascii="Arial" w:hAnsi="Arial" w:cs="Arial"/>
+        </w:rPr>
+      </w:pPr>
+    </w:p>
+    <w:p>
+      <w:pPr>
+        <w:rPr>
+          <w:rFonts w:ascii="Arial" w:hAnsi="Arial" w:cs="Arial"/>
+        </w:rPr>
+      </w:pPr>
       <w:r>
         <w:rPr>
           <w:rFonts w:ascii="Arial" w:hAnsi="Arial" w:cs="Arial"/>
           <w:color w:val="141414"/>
         </w:rPr>
-        <w:t xml:space="preserve">during nights and weekends. If you wish to report sexual misconduct or have questions about policies and procedures regarding sexual misconduct, please contact the College’s Title IX Coordinator at </w:t>
-      </w:r>
-      <w:r>
-        <w:rPr>
-          <w:rFonts w:ascii="Arial" w:hAnsi="Arial" w:cs="Arial"/>
-          <w:color w:val="0E24B2"/>
-        </w:rPr>
-        <w:t>201-684-7540</w:t>
-      </w:r>
-      <w:r>
+        <w:t xml:space="preserve">The College is legally obligated to investigate reports of sexual misconduct, and therefore it cannot guarantee the confidentiality of a report, but it will consider a request for confidentiality and respect it to the extent possible. </w:t>
+      </w:r>
+    </w:p>
+    <w:p>
+      <w:pPr>
+        <w:rPr>
+          <w:rFonts w:ascii="Arial" w:hAnsi="Arial" w:cs="Arial"/>
+        </w:rPr>
+      </w:pPr>
+    </w:p>
+    <w:p>
+      <w:pPr>
         <w:rPr>
           <w:rFonts w:ascii="Arial" w:hAnsi="Arial" w:cs="Arial"/>
           <w:color w:val="141414"/>
         </w:rPr>
-        <w:t xml:space="preserve">. </w:t>
-      </w:r>
-    </w:p>
-    <w:p>
-      <w:pPr>
-        <w:rPr>
-          <w:rFonts w:ascii="Arial" w:hAnsi="Arial" w:cs="Arial"/>
-        </w:rPr>
-      </w:pPr>
-    </w:p>
-    <w:p>
-      <w:pPr>
-        <w:rPr>
-          <w:rFonts w:ascii="Arial" w:hAnsi="Arial" w:cs="Arial"/>
-        </w:rPr>
       </w:pPr>
       <w:r>
         <w:rPr>
           <w:rFonts w:ascii="Arial" w:hAnsi="Arial" w:cs="Arial"/>
           <w:color w:val="141414"/>
         </w:rPr>
-        <w:t xml:space="preserve">The College is legally obligated to investigate reports of sexual misconduct, and therefore it cannot guarantee the confidentiality of a report, but it will consider a request for confidentiality and respect it to the extent possible. </w:t>
-      </w:r>
-    </w:p>
-    <w:p>
-      <w:pPr>
-        <w:rPr>
-          <w:rFonts w:ascii="Arial" w:hAnsi="Arial" w:cs="Arial"/>
-        </w:rPr>
-      </w:pPr>
-    </w:p>
-    <w:p>
-      <w:pPr>
-        <w:rPr>
-          <w:rFonts w:ascii="Arial" w:hAnsi="Arial" w:cs="Arial"/>
-          <w:color w:val="141414"/>
-        </w:rPr>
-      </w:pPr>
-      <w:r>
-        <w:rPr>
-          <w:rFonts w:ascii="Arial" w:hAnsi="Arial" w:cs="Arial"/>
-          <w:color w:val="141414"/>
-        </w:rPr>
-        <w:t xml:space="preserve">As a faculty member, I am also required by our </w:t>
-      </w:r>
-      <w:proofErr w:type="gramStart"/>
-      <w:r>
-        <w:rPr>
-          <w:rFonts w:ascii="Arial" w:hAnsi="Arial" w:cs="Arial"/>
-          <w:color w:val="141414"/>
-        </w:rPr>
-        <w:t>College</w:t>
-      </w:r>
-      <w:proofErr w:type="gramEnd"/>
-      <w:r>
-        <w:rPr>
-          <w:rFonts w:ascii="Arial" w:hAnsi="Arial" w:cs="Arial"/>
-          <w:color w:val="141414"/>
-        </w:rPr>
-        <w:t xml:space="preserve"> to report incidents of sexual misconduct and thus cannot guarantee confidentiality, but I will respect your privacy and only share the information with those who have a duty to respond. Should I become aware of an incident involving sexual misconduct, I must provide our Title IX Coordinator with relevant details such as the names of those involved in the incident. </w:t>
+        <w:t xml:space="preserve">As a faculty member, I am also required by our College to report incidents of sexual misconduct and thus cannot guarantee confidentiality, but I will respect your privacy and only share the information with those who have a duty to respond. Should I become aware of an incident involving sexual misconduct, I must provide our Title IX Coordinator with relevant details such as the names of those involved in the incident. </w:t>
       </w:r>
     </w:p>
     <w:p>
@@ -4491,25 +4079,7 @@
           <w:b/>
           <w:bCs/>
         </w:rPr>
-        <w:t xml:space="preserve">Introduction to the </w:t>
-      </w:r>
-      <w:proofErr w:type="spellStart"/>
-      <w:r>
-        <w:rPr>
-          <w:rFonts w:ascii="Arial" w:hAnsi="Arial" w:cs="Arial"/>
-          <w:b/>
-          <w:bCs/>
-        </w:rPr>
-        <w:t>SuperCollider</w:t>
-      </w:r>
-      <w:proofErr w:type="spellEnd"/>
-      <w:r>
-        <w:rPr>
-          <w:rFonts w:ascii="Arial" w:hAnsi="Arial" w:cs="Arial"/>
-          <w:b/>
-          <w:bCs/>
-        </w:rPr>
-        <w:t xml:space="preserve"> 3 </w:t>
+        <w:t xml:space="preserve">Introduction to the SuperCollider 3 </w:t>
       </w:r>
       <w:r>
         <w:rPr>
@@ -4899,19 +4469,11 @@
         </w:rPr>
         <w:t xml:space="preserve">, </w:t>
       </w:r>
-      <w:proofErr w:type="gramStart"/>
-      <w:r>
-        <w:rPr>
-          <w:rFonts w:ascii="Arial" w:hAnsi="Arial" w:cs="Arial"/>
-        </w:rPr>
-        <w:t>Modify</w:t>
-      </w:r>
-      <w:proofErr w:type="gramEnd"/>
-      <w:r>
-        <w:rPr>
-          <w:rFonts w:ascii="Arial" w:hAnsi="Arial" w:cs="Arial"/>
-        </w:rPr>
-        <w:t xml:space="preserve"> it so it sounds like something you are excited about.</w:t>
+      <w:r>
+        <w:rPr>
+          <w:rFonts w:ascii="Arial" w:hAnsi="Arial" w:cs="Arial"/>
+        </w:rPr>
+        <w:t>Modify it so it sounds like something you are excited about.</w:t>
       </w:r>
     </w:p>
     <w:p>
@@ -4979,43 +4541,7 @@
           <w:sz w:val="24"/>
           <w:szCs w:val="24"/>
         </w:rPr>
-        <w:t xml:space="preserve">Live Coding in </w:t>
-      </w:r>
-      <w:proofErr w:type="spellStart"/>
-      <w:r>
-        <w:rPr>
-          <w:color w:val="000000" w:themeColor="text1"/>
-          <w:sz w:val="24"/>
-          <w:szCs w:val="24"/>
-        </w:rPr>
-        <w:t>SuperCollider</w:t>
-      </w:r>
-      <w:proofErr w:type="spellEnd"/>
-      <w:r>
-        <w:rPr>
-          <w:color w:val="000000" w:themeColor="text1"/>
-          <w:sz w:val="24"/>
-          <w:szCs w:val="24"/>
-        </w:rPr>
-        <w:t xml:space="preserve">: a Tutorial with Eli </w:t>
-      </w:r>
-      <w:proofErr w:type="spellStart"/>
-      <w:r>
-        <w:rPr>
-          <w:color w:val="000000" w:themeColor="text1"/>
-          <w:sz w:val="24"/>
-          <w:szCs w:val="24"/>
-        </w:rPr>
-        <w:t>Fieldsteel</w:t>
-      </w:r>
-      <w:proofErr w:type="spellEnd"/>
-      <w:r>
-        <w:rPr>
-          <w:color w:val="000000" w:themeColor="text1"/>
-          <w:sz w:val="24"/>
-          <w:szCs w:val="24"/>
-        </w:rPr>
-        <w:t xml:space="preserve"> </w:t>
+        <w:t xml:space="preserve">Live Coding in SuperCollider: a Tutorial with Eli Fieldsteel </w:t>
       </w:r>
       <w:hyperlink r:id="rId22" w:history="1">
         <w:r>
@@ -5192,65 +4718,34 @@
         </w:rPr>
         <w:t xml:space="preserve">Learning </w:t>
       </w:r>
-      <w:proofErr w:type="spellStart"/>
-      <w:r>
-        <w:rPr>
-          <w:iCs/>
-          <w:color w:val="000000" w:themeColor="text1"/>
-          <w:sz w:val="24"/>
-          <w:szCs w:val="24"/>
-        </w:rPr>
-        <w:t>NodeProxy</w:t>
-      </w:r>
-      <w:proofErr w:type="spellEnd"/>
-      <w:r>
-        <w:rPr>
-          <w:iCs/>
-          <w:color w:val="000000" w:themeColor="text1"/>
-          <w:sz w:val="24"/>
-          <w:szCs w:val="24"/>
-        </w:rPr>
-        <w:t>—The simplest and most direct way to recycle and utilize code in instruments, live, in Supercollider.</w:t>
-      </w:r>
-    </w:p>
-    <w:p>
-      <w:pPr>
-        <w:pStyle w:val="Normal1"/>
-        <w:rPr>
-          <w:iCs/>
-          <w:color w:val="000000" w:themeColor="text1"/>
-          <w:sz w:val="24"/>
-          <w:szCs w:val="24"/>
-        </w:rPr>
-      </w:pPr>
-      <w:r>
-        <w:rPr>
-          <w:iCs/>
-          <w:color w:val="000000" w:themeColor="text1"/>
-          <w:sz w:val="24"/>
-          <w:szCs w:val="24"/>
-        </w:rPr>
-        <w:t xml:space="preserve">Learning </w:t>
-      </w:r>
-      <w:proofErr w:type="spellStart"/>
-      <w:r>
-        <w:rPr>
-          <w:iCs/>
-          <w:color w:val="000000" w:themeColor="text1"/>
-          <w:sz w:val="24"/>
-          <w:szCs w:val="24"/>
-        </w:rPr>
-        <w:t>Synthdef</w:t>
-      </w:r>
-      <w:proofErr w:type="spellEnd"/>
-      <w:r>
-        <w:rPr>
-          <w:iCs/>
-          <w:color w:val="000000" w:themeColor="text1"/>
-          <w:sz w:val="24"/>
-          <w:szCs w:val="24"/>
-        </w:rPr>
-        <w:t>—the standard way to program synths for global programming concepts in SC</w:t>
+      <w:r>
+        <w:rPr>
+          <w:iCs/>
+          <w:color w:val="000000" w:themeColor="text1"/>
+          <w:sz w:val="24"/>
+          <w:szCs w:val="24"/>
+        </w:rPr>
+        <w:t>NodeProxy—The simplest and most direct way to recycle and utilize code in instruments, live, in Supercollider.</w:t>
+      </w:r>
+    </w:p>
+    <w:p>
+      <w:pPr>
+        <w:pStyle w:val="Normal1"/>
+        <w:rPr>
+          <w:iCs/>
+          <w:color w:val="000000" w:themeColor="text1"/>
+          <w:sz w:val="24"/>
+          <w:szCs w:val="24"/>
+        </w:rPr>
+      </w:pPr>
+      <w:r>
+        <w:rPr>
+          <w:iCs/>
+          <w:color w:val="000000" w:themeColor="text1"/>
+          <w:sz w:val="24"/>
+          <w:szCs w:val="24"/>
+        </w:rPr>
+        <w:t>Learning Synthdef—the standard way to program synths for global programming concepts in SC</w:t>
       </w:r>
     </w:p>
     <w:p>
@@ -5347,39 +4842,17 @@
           <w:sz w:val="24"/>
           <w:szCs w:val="24"/>
         </w:rPr>
-        <w:t xml:space="preserve">Prepare 3 synthesis tools in Supercollider that work with </w:t>
-      </w:r>
-      <w:proofErr w:type="spellStart"/>
-      <w:r>
-        <w:rPr>
-          <w:iCs/>
-          <w:color w:val="000000" w:themeColor="text1"/>
-          <w:sz w:val="24"/>
-          <w:szCs w:val="24"/>
-        </w:rPr>
-        <w:t>NodeProxy</w:t>
-      </w:r>
-      <w:proofErr w:type="spellEnd"/>
-      <w:r>
-        <w:rPr>
-          <w:iCs/>
-          <w:color w:val="000000" w:themeColor="text1"/>
-          <w:sz w:val="24"/>
-          <w:szCs w:val="24"/>
-        </w:rPr>
-        <w:t xml:space="preserve"> OR </w:t>
-      </w:r>
-      <w:proofErr w:type="spellStart"/>
-      <w:r>
-        <w:rPr>
-          <w:iCs/>
-          <w:color w:val="000000" w:themeColor="text1"/>
-          <w:sz w:val="24"/>
-          <w:szCs w:val="24"/>
-        </w:rPr>
-        <w:t>synthdef</w:t>
-      </w:r>
-      <w:proofErr w:type="spellEnd"/>
+        <w:t>Prepare 3 synthesis tools in Supercollider that work with NodeProxy</w:t>
+      </w:r>
+      <w:r>
+        <w:rPr>
+          <w:iCs/>
+          <w:color w:val="000000" w:themeColor="text1"/>
+          <w:sz w:val="24"/>
+          <w:szCs w:val="24"/>
+        </w:rPr>
+        <w:t xml:space="preserve"> OR synthdef</w:t>
+      </w:r>
       <w:r>
         <w:rPr>
           <w:iCs/>
@@ -5423,19 +4896,8 @@
           <w:sz w:val="24"/>
           <w:szCs w:val="24"/>
         </w:rPr>
-        <w:t xml:space="preserve"> </w:t>
-      </w:r>
-      <w:proofErr w:type="spellStart"/>
-      <w:r>
-        <w:rPr>
-          <w:iCs/>
-          <w:color w:val="000000" w:themeColor="text1"/>
-          <w:sz w:val="24"/>
-          <w:szCs w:val="24"/>
-        </w:rPr>
-        <w:t>gui</w:t>
-      </w:r>
-      <w:proofErr w:type="spellEnd"/>
+        <w:t xml:space="preserve"> gui</w:t>
+      </w:r>
       <w:r>
         <w:rPr>
           <w:iCs/>
@@ -5683,75 +5145,255 @@
         </w:rPr>
         <w:t>Etude 2 Review: class improv!</w:t>
       </w:r>
-    </w:p>
-    <w:p>
-      <w:pPr>
-        <w:pStyle w:val="Normal1"/>
-        <w:rPr>
-          <w:iCs/>
-          <w:color w:val="000000" w:themeColor="text1"/>
-          <w:sz w:val="24"/>
-          <w:szCs w:val="24"/>
-        </w:rPr>
-      </w:pPr>
-    </w:p>
-    <w:p>
-      <w:pPr>
-        <w:pStyle w:val="Normal1"/>
-        <w:rPr>
-          <w:i/>
-          <w:color w:val="000000" w:themeColor="text1"/>
-          <w:sz w:val="24"/>
-          <w:szCs w:val="24"/>
-        </w:rPr>
-      </w:pPr>
-      <w:r>
-        <w:rPr>
-          <w:iCs/>
-          <w:color w:val="000000" w:themeColor="text1"/>
-          <w:sz w:val="24"/>
-          <w:szCs w:val="24"/>
-        </w:rPr>
-        <w:t xml:space="preserve">For this assignment, </w:t>
-      </w:r>
-      <w:r>
-        <w:rPr>
-          <w:i/>
-          <w:color w:val="000000" w:themeColor="text1"/>
-          <w:sz w:val="24"/>
-          <w:szCs w:val="24"/>
-        </w:rPr>
-        <w:t xml:space="preserve">Adapt “Surging” </w:t>
-      </w:r>
-      <w:r>
-        <w:rPr>
-          <w:iCs/>
-          <w:color w:val="000000" w:themeColor="text1"/>
-          <w:sz w:val="24"/>
-          <w:szCs w:val="24"/>
-        </w:rPr>
-        <w:t xml:space="preserve">to </w:t>
-      </w:r>
-      <w:r>
-        <w:rPr>
-          <w:i/>
-          <w:color w:val="000000" w:themeColor="text1"/>
-          <w:sz w:val="24"/>
-          <w:szCs w:val="24"/>
-        </w:rPr>
-        <w:t>On the Other Ocean</w:t>
-      </w:r>
-    </w:p>
-    <w:p>
-      <w:pPr>
-        <w:pStyle w:val="Normal1"/>
-        <w:rPr>
-          <w:iCs/>
-          <w:color w:val="000000" w:themeColor="text1"/>
-          <w:sz w:val="24"/>
-          <w:szCs w:val="24"/>
-        </w:rPr>
-      </w:pPr>
+      <w:r>
+        <w:rPr>
+          <w:iCs/>
+          <w:color w:val="000000" w:themeColor="text1"/>
+          <w:sz w:val="24"/>
+          <w:szCs w:val="24"/>
+        </w:rPr>
+        <w:t>...delay class improv until week 5.</w:t>
+      </w:r>
+    </w:p>
+    <w:p>
+      <w:pPr>
+        <w:pStyle w:val="Normal1"/>
+        <w:rPr>
+          <w:iCs/>
+          <w:color w:val="000000" w:themeColor="text1"/>
+          <w:sz w:val="24"/>
+          <w:szCs w:val="24"/>
+        </w:rPr>
+      </w:pPr>
+    </w:p>
+    <w:p>
+      <w:pPr>
+        <w:pStyle w:val="Normal1"/>
+        <w:rPr>
+          <w:b/>
+          <w:bCs/>
+          <w:iCs/>
+          <w:color w:val="000000" w:themeColor="text1"/>
+          <w:sz w:val="24"/>
+          <w:szCs w:val="24"/>
+        </w:rPr>
+      </w:pPr>
+      <w:r>
+        <w:rPr>
+          <w:b/>
+          <w:bCs/>
+          <w:iCs/>
+          <w:color w:val="000000" w:themeColor="text1"/>
+          <w:sz w:val="24"/>
+          <w:szCs w:val="24"/>
+        </w:rPr>
+        <w:t>Etude 3:</w:t>
+      </w:r>
+      <w:r>
+        <w:rPr>
+          <w:b/>
+          <w:bCs/>
+          <w:iCs/>
+          <w:color w:val="000000" w:themeColor="text1"/>
+          <w:sz w:val="24"/>
+          <w:szCs w:val="24"/>
+        </w:rPr>
+        <w:t xml:space="preserve"> Harvesting</w:t>
+      </w:r>
+    </w:p>
+    <w:p>
+      <w:pPr>
+        <w:pStyle w:val="Normal1"/>
+        <w:rPr>
+          <w:iCs/>
+          <w:color w:val="000000" w:themeColor="text1"/>
+          <w:sz w:val="24"/>
+          <w:szCs w:val="24"/>
+        </w:rPr>
+      </w:pPr>
+      <w:r>
+        <w:rPr>
+          <w:iCs/>
+          <w:color w:val="000000" w:themeColor="text1"/>
+          <w:sz w:val="24"/>
+          <w:szCs w:val="24"/>
+        </w:rPr>
+        <w:t xml:space="preserve">Record some sounds or bring sound sound files, trimmed and normalized, to be used as audio clay. </w:t>
+      </w:r>
+    </w:p>
+    <w:p>
+      <w:pPr>
+        <w:pStyle w:val="Normal1"/>
+        <w:rPr>
+          <w:iCs/>
+          <w:color w:val="000000" w:themeColor="text1"/>
+          <w:sz w:val="24"/>
+          <w:szCs w:val="24"/>
+        </w:rPr>
+      </w:pPr>
+      <w:r>
+        <w:rPr>
+          <w:iCs/>
+          <w:color w:val="000000" w:themeColor="text1"/>
+          <w:sz w:val="24"/>
+          <w:szCs w:val="24"/>
+        </w:rPr>
+        <w:t>Sounds should be wav</w:t>
+      </w:r>
+      <w:r>
+        <w:rPr>
+          <w:iCs/>
+          <w:color w:val="000000" w:themeColor="text1"/>
+          <w:sz w:val="24"/>
+          <w:szCs w:val="24"/>
+        </w:rPr>
+        <w:t>….can be stereo OR mono, up to you.</w:t>
+      </w:r>
+    </w:p>
+    <w:p>
+      <w:pPr>
+        <w:pStyle w:val="Normal1"/>
+        <w:rPr>
+          <w:iCs/>
+          <w:color w:val="000000" w:themeColor="text1"/>
+          <w:sz w:val="24"/>
+          <w:szCs w:val="24"/>
+        </w:rPr>
+      </w:pPr>
+      <w:r>
+        <w:rPr>
+          <w:iCs/>
+          <w:color w:val="000000" w:themeColor="text1"/>
+          <w:sz w:val="24"/>
+          <w:szCs w:val="24"/>
+        </w:rPr>
+        <w:t xml:space="preserve">bring 5 short sounds and </w:t>
+      </w:r>
+      <w:r>
+        <w:rPr>
+          <w:iCs/>
+          <w:color w:val="000000" w:themeColor="text1"/>
+          <w:sz w:val="24"/>
+          <w:szCs w:val="24"/>
+        </w:rPr>
+        <w:t>3</w:t>
+      </w:r>
+      <w:r>
+        <w:rPr>
+          <w:iCs/>
+          <w:color w:val="000000" w:themeColor="text1"/>
+          <w:sz w:val="24"/>
+          <w:szCs w:val="24"/>
+        </w:rPr>
+        <w:t xml:space="preserve"> longish sound</w:t>
+      </w:r>
+      <w:r>
+        <w:rPr>
+          <w:iCs/>
+          <w:color w:val="000000" w:themeColor="text1"/>
+          <w:sz w:val="24"/>
+          <w:szCs w:val="24"/>
+        </w:rPr>
+        <w:t>s</w:t>
+      </w:r>
+      <w:r>
+        <w:rPr>
+          <w:iCs/>
+          <w:color w:val="000000" w:themeColor="text1"/>
+          <w:sz w:val="24"/>
+          <w:szCs w:val="24"/>
+        </w:rPr>
+        <w:t>.</w:t>
+      </w:r>
+    </w:p>
+    <w:p>
+      <w:pPr>
+        <w:pStyle w:val="Normal1"/>
+        <w:rPr>
+          <w:iCs/>
+          <w:color w:val="000000" w:themeColor="text1"/>
+          <w:sz w:val="24"/>
+          <w:szCs w:val="24"/>
+        </w:rPr>
+      </w:pPr>
+      <w:r>
+        <w:rPr>
+          <w:iCs/>
+          <w:color w:val="000000" w:themeColor="text1"/>
+          <w:sz w:val="24"/>
+          <w:szCs w:val="24"/>
+        </w:rPr>
+        <w:t>Short means…like drum sounds.</w:t>
+      </w:r>
+    </w:p>
+    <w:p>
+      <w:pPr>
+        <w:pStyle w:val="Normal1"/>
+        <w:rPr>
+          <w:iCs/>
+          <w:color w:val="000000" w:themeColor="text1"/>
+          <w:sz w:val="24"/>
+          <w:szCs w:val="24"/>
+        </w:rPr>
+      </w:pPr>
+      <w:r>
+        <w:rPr>
+          <w:iCs/>
+          <w:color w:val="000000" w:themeColor="text1"/>
+          <w:sz w:val="24"/>
+          <w:szCs w:val="24"/>
+        </w:rPr>
+        <w:t>Long means like 20-60 seconds.</w:t>
+      </w:r>
+    </w:p>
+    <w:p>
+      <w:pPr>
+        <w:pStyle w:val="Normal1"/>
+        <w:rPr>
+          <w:iCs/>
+          <w:color w:val="000000" w:themeColor="text1"/>
+          <w:sz w:val="24"/>
+          <w:szCs w:val="24"/>
+        </w:rPr>
+      </w:pPr>
+      <w:r>
+        <w:rPr>
+          <w:iCs/>
+          <w:color w:val="000000" w:themeColor="text1"/>
+          <w:sz w:val="24"/>
+          <w:szCs w:val="24"/>
+        </w:rPr>
+        <w:t>Sound sources c</w:t>
+      </w:r>
+      <w:r>
+        <w:rPr>
+          <w:iCs/>
+          <w:color w:val="000000" w:themeColor="text1"/>
+          <w:sz w:val="24"/>
+          <w:szCs w:val="24"/>
+        </w:rPr>
+        <w:t>an be field recordings…or music…should and could be something you recorded…</w:t>
+      </w:r>
+    </w:p>
+    <w:p>
+      <w:pPr>
+        <w:pStyle w:val="Normal1"/>
+        <w:rPr>
+          <w:iCs/>
+          <w:color w:val="000000" w:themeColor="text1"/>
+          <w:sz w:val="24"/>
+          <w:szCs w:val="24"/>
+        </w:rPr>
+      </w:pPr>
+      <w:r>
+        <w:rPr>
+          <w:iCs/>
+          <w:color w:val="000000" w:themeColor="text1"/>
+          <w:sz w:val="24"/>
+          <w:szCs w:val="24"/>
+        </w:rPr>
+        <w:t>But think about DJ culture and remember it doesn’t have to be recorded,  you can just be the DJ…</w:t>
+      </w:r>
     </w:p>
     <w:p>
       <w:pPr>
@@ -5936,7 +5578,7 @@
           <w:sz w:val="24"/>
           <w:szCs w:val="24"/>
         </w:rPr>
-        <w:t>Exploring different Pitch Sensing tools in each program</w:t>
+        <w:t>Introduction to Sampling Tools in SC</w:t>
       </w:r>
     </w:p>
     <w:p>
@@ -5970,7 +5612,17 @@
           <w:sz w:val="24"/>
           <w:szCs w:val="24"/>
         </w:rPr>
-        <w:t>Introduction to Iteration</w:t>
+        <w:t>Reviewing Etude 3</w:t>
+      </w:r>
+      <w:r>
+        <w:rPr>
+          <w:rFonts w:ascii="Arial" w:hAnsi="Arial" w:cs="Arial"/>
+          <w:iCs/>
+          <w:color w:val="000000" w:themeColor="text1"/>
+          <w:sz w:val="24"/>
+          <w:szCs w:val="24"/>
+        </w:rPr>
+        <w:t xml:space="preserve">: </w:t>
       </w:r>
     </w:p>
     <w:p>
@@ -5992,8 +5644,7 @@
           <w:sz w:val="24"/>
           <w:szCs w:val="24"/>
         </w:rPr>
-        <w:br/>
-        <w:t>Introduction to Gui</w:t>
+        <w:t>What were your solutions?</w:t>
       </w:r>
     </w:p>
     <w:p>
@@ -6019,26 +5670,6 @@
           <w:szCs w:val="24"/>
         </w:rPr>
       </w:pPr>
-      <w:r>
-        <w:rPr>
-          <w:rFonts w:ascii="Arial" w:hAnsi="Arial" w:cs="Arial"/>
-          <w:iCs/>
-          <w:color w:val="000000" w:themeColor="text1"/>
-          <w:sz w:val="24"/>
-          <w:szCs w:val="24"/>
-        </w:rPr>
-        <w:t>Reviewing Etude 3</w:t>
-      </w:r>
-      <w:r>
-        <w:rPr>
-          <w:rFonts w:ascii="Arial" w:hAnsi="Arial" w:cs="Arial"/>
-          <w:iCs/>
-          <w:color w:val="000000" w:themeColor="text1"/>
-          <w:sz w:val="24"/>
-          <w:szCs w:val="24"/>
-        </w:rPr>
-        <w:t xml:space="preserve">: </w:t>
-      </w:r>
     </w:p>
     <w:p>
       <w:pPr>
@@ -6059,7 +5690,7 @@
           <w:sz w:val="24"/>
           <w:szCs w:val="24"/>
         </w:rPr>
-        <w:t>What were your solutions?</w:t>
+        <w:t>Etude 4:</w:t>
       </w:r>
     </w:p>
     <w:p>
@@ -6073,125 +5704,15 @@
           <w:szCs w:val="24"/>
         </w:rPr>
       </w:pPr>
-    </w:p>
-    <w:p>
-      <w:pPr>
-        <w:pStyle w:val="noformatting"/>
-        <w:rPr>
-          <w:rFonts w:ascii="Arial" w:hAnsi="Arial" w:cs="Arial"/>
-          <w:iCs/>
-          <w:color w:val="000000" w:themeColor="text1"/>
-          <w:sz w:val="24"/>
-          <w:szCs w:val="24"/>
-        </w:rPr>
-      </w:pPr>
-      <w:r>
-        <w:rPr>
-          <w:rFonts w:ascii="Arial" w:hAnsi="Arial" w:cs="Arial"/>
-          <w:iCs/>
-          <w:color w:val="000000" w:themeColor="text1"/>
-          <w:sz w:val="24"/>
-          <w:szCs w:val="24"/>
-        </w:rPr>
-        <w:t>(Potentially)</w:t>
-      </w:r>
-      <w:r>
-        <w:rPr>
-          <w:rFonts w:ascii="Arial" w:hAnsi="Arial" w:cs="Arial"/>
-          <w:iCs/>
-          <w:color w:val="000000" w:themeColor="text1"/>
-          <w:sz w:val="24"/>
-          <w:szCs w:val="24"/>
-        </w:rPr>
-        <w:t xml:space="preserve"> </w:t>
-      </w:r>
-      <w:r>
-        <w:rPr>
-          <w:rFonts w:ascii="Arial" w:hAnsi="Arial" w:cs="Arial"/>
-          <w:iCs/>
-          <w:color w:val="000000" w:themeColor="text1"/>
-          <w:sz w:val="24"/>
-          <w:szCs w:val="24"/>
-        </w:rPr>
-        <w:t>Artist Talk with David Behrman</w:t>
-      </w:r>
-    </w:p>
-    <w:p>
-      <w:pPr>
-        <w:pStyle w:val="noformatting"/>
-        <w:rPr>
-          <w:rFonts w:ascii="Arial" w:hAnsi="Arial" w:cs="Arial"/>
-          <w:iCs/>
-          <w:color w:val="000000" w:themeColor="text1"/>
-          <w:sz w:val="24"/>
-          <w:szCs w:val="24"/>
-        </w:rPr>
-      </w:pPr>
-    </w:p>
-    <w:p>
-      <w:pPr>
-        <w:pStyle w:val="noformatting"/>
-        <w:rPr>
-          <w:rFonts w:ascii="Arial" w:hAnsi="Arial" w:cs="Arial"/>
-          <w:iCs/>
-          <w:color w:val="000000" w:themeColor="text1"/>
-          <w:sz w:val="24"/>
-          <w:szCs w:val="24"/>
-        </w:rPr>
-      </w:pPr>
-      <w:r>
-        <w:rPr>
-          <w:rFonts w:ascii="Arial" w:hAnsi="Arial" w:cs="Arial"/>
-          <w:iCs/>
-          <w:color w:val="000000" w:themeColor="text1"/>
-          <w:sz w:val="24"/>
-          <w:szCs w:val="24"/>
-        </w:rPr>
-        <w:t>Etude 4:</w:t>
-      </w:r>
-    </w:p>
-    <w:p>
-      <w:pPr>
-        <w:pStyle w:val="noformatting"/>
-        <w:rPr>
-          <w:rFonts w:ascii="Arial" w:hAnsi="Arial" w:cs="Arial"/>
-          <w:iCs/>
-          <w:color w:val="000000" w:themeColor="text1"/>
-          <w:sz w:val="24"/>
-          <w:szCs w:val="24"/>
-        </w:rPr>
-      </w:pPr>
-      <w:r>
-        <w:rPr>
-          <w:rFonts w:ascii="Arial" w:hAnsi="Arial" w:cs="Arial"/>
-          <w:iCs/>
-          <w:color w:val="000000" w:themeColor="text1"/>
-          <w:sz w:val="24"/>
-          <w:szCs w:val="24"/>
-        </w:rPr>
-        <w:t xml:space="preserve">No HW, but if you’re behind schedule office hours. Or write an </w:t>
-      </w:r>
-      <w:proofErr w:type="spellStart"/>
-      <w:r>
-        <w:rPr>
-          <w:rFonts w:ascii="Arial" w:hAnsi="Arial" w:cs="Arial"/>
-          <w:iCs/>
-          <w:color w:val="000000" w:themeColor="text1"/>
-          <w:sz w:val="24"/>
-          <w:szCs w:val="24"/>
-        </w:rPr>
-        <w:t>NodeProxy</w:t>
-      </w:r>
-      <w:proofErr w:type="spellEnd"/>
-      <w:r>
-        <w:rPr>
-          <w:rFonts w:ascii="Arial" w:hAnsi="Arial" w:cs="Arial"/>
-          <w:iCs/>
-          <w:color w:val="000000" w:themeColor="text1"/>
-          <w:sz w:val="24"/>
-          <w:szCs w:val="24"/>
-        </w:rPr>
-        <w:t xml:space="preserve"> instrument from Floating Point Errors or Crows with arguments that can be controlled.</w:t>
+      <w:r>
+        <w:rPr>
+          <w:rFonts w:ascii="Arial" w:hAnsi="Arial" w:cs="Arial"/>
+          <w:iCs/>
+          <w:color w:val="000000" w:themeColor="text1"/>
+          <w:sz w:val="24"/>
+          <w:szCs w:val="24"/>
+        </w:rPr>
+        <w:t>No HW, but if you’re behind schedule office hours. Or write an NodeProxy instrument from Floating Point Errors or Crows with arguments that can be controlled.</w:t>
       </w:r>
     </w:p>
     <w:p>
@@ -6374,25 +5895,14 @@
           <w:szCs w:val="24"/>
         </w:rPr>
       </w:pPr>
-      <w:proofErr w:type="spellStart"/>
-      <w:r>
-        <w:rPr>
-          <w:iCs/>
-          <w:color w:val="000000" w:themeColor="text1"/>
-          <w:sz w:val="24"/>
-          <w:szCs w:val="24"/>
-        </w:rPr>
-        <w:t>bytebeat</w:t>
-      </w:r>
-      <w:proofErr w:type="spellEnd"/>
-      <w:r>
-        <w:rPr>
-          <w:iCs/>
-          <w:color w:val="000000" w:themeColor="text1"/>
-          <w:sz w:val="24"/>
-          <w:szCs w:val="24"/>
-        </w:rPr>
-        <w:t xml:space="preserve"> composer</w:t>
+      <w:r>
+        <w:rPr>
+          <w:iCs/>
+          <w:color w:val="000000" w:themeColor="text1"/>
+          <w:sz w:val="24"/>
+          <w:szCs w:val="24"/>
+        </w:rPr>
+        <w:t>bytebeat composer</w:t>
       </w:r>
     </w:p>
     <w:p>
@@ -6469,29 +5979,7 @@
           <w:szCs w:val="24"/>
           <w:u w:val="single"/>
         </w:rPr>
-        <w:t xml:space="preserve">Transcribe these measures into supercollider code for </w:t>
-      </w:r>
-      <w:proofErr w:type="gramStart"/>
-      <w:r>
-        <w:rPr>
-          <w:iCs/>
-          <w:color w:val="000000" w:themeColor="text1"/>
-          <w:sz w:val="24"/>
-          <w:szCs w:val="24"/>
-          <w:u w:val="single"/>
-        </w:rPr>
-        <w:t>In</w:t>
-      </w:r>
-      <w:proofErr w:type="gramEnd"/>
-      <w:r>
-        <w:rPr>
-          <w:iCs/>
-          <w:color w:val="000000" w:themeColor="text1"/>
-          <w:sz w:val="24"/>
-          <w:szCs w:val="24"/>
-          <w:u w:val="single"/>
-        </w:rPr>
-        <w:t xml:space="preserve"> C, make sure you follow the exact format.</w:t>
+        <w:t>Transcribe these measures into supercollider code for In C, make sure you follow the exact format.</w:t>
       </w:r>
     </w:p>
     <w:p>
@@ -6757,87 +6245,14 @@
           <w:szCs w:val="24"/>
         </w:rPr>
       </w:pPr>
-      <w:proofErr w:type="spellStart"/>
-      <w:proofErr w:type="gramStart"/>
-      <w:r>
-        <w:rPr>
-          <w:iCs/>
-          <w:color w:val="000000" w:themeColor="text1"/>
-          <w:sz w:val="24"/>
-          <w:szCs w:val="24"/>
-        </w:rPr>
-        <w:t>Its</w:t>
-      </w:r>
-      <w:proofErr w:type="spellEnd"/>
-      <w:proofErr w:type="gramEnd"/>
-      <w:r>
-        <w:rPr>
-          <w:iCs/>
-          <w:color w:val="000000" w:themeColor="text1"/>
-          <w:sz w:val="24"/>
-          <w:szCs w:val="24"/>
-        </w:rPr>
-        <w:t xml:space="preserve"> up to you. You can use stuff from </w:t>
-      </w:r>
-      <w:proofErr w:type="spellStart"/>
-      <w:r>
-        <w:rPr>
-          <w:iCs/>
-          <w:color w:val="000000" w:themeColor="text1"/>
-          <w:sz w:val="24"/>
-          <w:szCs w:val="24"/>
-        </w:rPr>
-        <w:t>thre</w:t>
-      </w:r>
-      <w:proofErr w:type="spellEnd"/>
-      <w:r>
-        <w:rPr>
-          <w:iCs/>
-          <w:color w:val="000000" w:themeColor="text1"/>
-          <w:sz w:val="24"/>
-          <w:szCs w:val="24"/>
-        </w:rPr>
-        <w:t xml:space="preserve"> SCLORK </w:t>
-      </w:r>
-      <w:proofErr w:type="spellStart"/>
-      <w:r>
-        <w:rPr>
-          <w:iCs/>
-          <w:color w:val="000000" w:themeColor="text1"/>
-          <w:sz w:val="24"/>
-          <w:szCs w:val="24"/>
-        </w:rPr>
-        <w:t>respository</w:t>
-      </w:r>
-      <w:proofErr w:type="spellEnd"/>
-      <w:r>
-        <w:rPr>
-          <w:iCs/>
-          <w:color w:val="000000" w:themeColor="text1"/>
-          <w:sz w:val="24"/>
-          <w:szCs w:val="24"/>
-        </w:rPr>
-        <w:t xml:space="preserve"> and you can design your own </w:t>
-      </w:r>
-      <w:proofErr w:type="spellStart"/>
-      <w:r>
-        <w:rPr>
-          <w:iCs/>
-          <w:color w:val="000000" w:themeColor="text1"/>
-          <w:sz w:val="24"/>
-          <w:szCs w:val="24"/>
-        </w:rPr>
-        <w:t>synthdefs</w:t>
-      </w:r>
-      <w:proofErr w:type="spellEnd"/>
-      <w:r>
-        <w:rPr>
-          <w:iCs/>
-          <w:color w:val="000000" w:themeColor="text1"/>
-          <w:sz w:val="24"/>
-          <w:szCs w:val="24"/>
-        </w:rPr>
-        <w:t>. And you can hack on effects like filters and reverbs.</w:t>
+      <w:r>
+        <w:rPr>
+          <w:iCs/>
+          <w:color w:val="000000" w:themeColor="text1"/>
+          <w:sz w:val="24"/>
+          <w:szCs w:val="24"/>
+        </w:rPr>
+        <w:t>Its up to you. You can use stuff from thre SCLORK respository and you can design your own synthdefs. And you can hack on effects like filters and reverbs.</w:t>
       </w:r>
     </w:p>
     <w:p>
@@ -6969,10 +6384,12 @@
           <w:sz w:val="24"/>
           <w:szCs w:val="24"/>
         </w:rPr>
-        <w:t xml:space="preserve">Introduction to </w:t>
-      </w:r>
-      <w:proofErr w:type="spellStart"/>
-      <w:r>
+        <w:t>Introduction to Playbuf</w:t>
+      </w:r>
+    </w:p>
+    <w:p>
+      <w:pPr>
+        <w:pStyle w:val="Normal1"/>
         <w:rPr>
           <w:b/>
           <w:bCs/>
@@ -6981,13 +6398,8 @@
           <w:sz w:val="24"/>
           <w:szCs w:val="24"/>
         </w:rPr>
-        <w:t>Playbuf</w:t>
-      </w:r>
-      <w:proofErr w:type="spellEnd"/>
-    </w:p>
-    <w:p>
-      <w:pPr>
-        <w:pStyle w:val="Normal1"/>
+      </w:pPr>
+      <w:r>
         <w:rPr>
           <w:b/>
           <w:bCs/>
@@ -6996,8 +6408,12 @@
           <w:sz w:val="24"/>
           <w:szCs w:val="24"/>
         </w:rPr>
-      </w:pPr>
-      <w:r>
+        <w:t>Introduction to Granular Synthesis</w:t>
+      </w:r>
+    </w:p>
+    <w:p>
+      <w:pPr>
+        <w:pStyle w:val="Normal1"/>
         <w:rPr>
           <w:b/>
           <w:bCs/>
@@ -7006,12 +6422,8 @@
           <w:sz w:val="24"/>
           <w:szCs w:val="24"/>
         </w:rPr>
-        <w:t>Introduction to Granular Synthesis</w:t>
-      </w:r>
-    </w:p>
-    <w:p>
-      <w:pPr>
-        <w:pStyle w:val="Normal1"/>
+      </w:pPr>
+      <w:r>
         <w:rPr>
           <w:b/>
           <w:bCs/>
@@ -7020,44 +6432,8 @@
           <w:sz w:val="24"/>
           <w:szCs w:val="24"/>
         </w:rPr>
-      </w:pPr>
-      <w:proofErr w:type="spellStart"/>
-      <w:r>
-        <w:rPr>
-          <w:b/>
-          <w:bCs/>
-          <w:iCs/>
-          <w:color w:val="000000" w:themeColor="text1"/>
-          <w:sz w:val="24"/>
-          <w:szCs w:val="24"/>
-        </w:rPr>
-        <w:t>Introduciton</w:t>
-      </w:r>
-      <w:proofErr w:type="spellEnd"/>
-      <w:r>
-        <w:rPr>
-          <w:b/>
-          <w:bCs/>
-          <w:iCs/>
-          <w:color w:val="000000" w:themeColor="text1"/>
-          <w:sz w:val="24"/>
-          <w:szCs w:val="24"/>
-        </w:rPr>
-        <w:t xml:space="preserve"> to 2</w:t>
-      </w:r>
-      <w:proofErr w:type="gramStart"/>
-      <w:r>
-        <w:rPr>
-          <w:b/>
-          <w:bCs/>
-          <w:iCs/>
-          <w:color w:val="000000" w:themeColor="text1"/>
-          <w:sz w:val="24"/>
-          <w:szCs w:val="24"/>
-        </w:rPr>
-        <w:t>d.wave</w:t>
-      </w:r>
-      <w:proofErr w:type="gramEnd"/>
+        <w:t>Introduciton to 2d.wave</w:t>
+      </w:r>
     </w:p>
     <w:p>
       <w:pPr>
@@ -7144,127 +6520,7 @@
           <w:sz w:val="24"/>
           <w:szCs w:val="24"/>
         </w:rPr>
-        <w:t xml:space="preserve">Incorporate a sampler into your favorite </w:t>
-      </w:r>
-      <w:proofErr w:type="spellStart"/>
-      <w:r>
-        <w:rPr>
-          <w:iCs/>
-          <w:color w:val="000000" w:themeColor="text1"/>
-          <w:sz w:val="24"/>
-          <w:szCs w:val="24"/>
-        </w:rPr>
-        <w:t>Synthdef</w:t>
-      </w:r>
-      <w:proofErr w:type="spellEnd"/>
-      <w:r>
-        <w:rPr>
-          <w:iCs/>
-          <w:color w:val="000000" w:themeColor="text1"/>
-          <w:sz w:val="24"/>
-          <w:szCs w:val="24"/>
-        </w:rPr>
-        <w:t xml:space="preserve"> or </w:t>
-      </w:r>
-      <w:proofErr w:type="spellStart"/>
-      <w:r>
-        <w:rPr>
-          <w:iCs/>
-          <w:color w:val="000000" w:themeColor="text1"/>
-          <w:sz w:val="24"/>
-          <w:szCs w:val="24"/>
-        </w:rPr>
-        <w:t>Nodeproxy</w:t>
-      </w:r>
-      <w:proofErr w:type="spellEnd"/>
-      <w:r>
-        <w:rPr>
-          <w:iCs/>
-          <w:color w:val="000000" w:themeColor="text1"/>
-          <w:sz w:val="24"/>
-          <w:szCs w:val="24"/>
-        </w:rPr>
-        <w:t xml:space="preserve"> tools thus far. Remove synthesis engine and replace it with </w:t>
-      </w:r>
-      <w:proofErr w:type="spellStart"/>
-      <w:r>
-        <w:rPr>
-          <w:iCs/>
-          <w:color w:val="000000" w:themeColor="text1"/>
-          <w:sz w:val="24"/>
-          <w:szCs w:val="24"/>
-        </w:rPr>
-        <w:t>Playbuf</w:t>
-      </w:r>
-      <w:proofErr w:type="spellEnd"/>
-      <w:r>
-        <w:rPr>
-          <w:iCs/>
-          <w:color w:val="000000" w:themeColor="text1"/>
-          <w:sz w:val="24"/>
-          <w:szCs w:val="24"/>
-        </w:rPr>
-        <w:t xml:space="preserve">, </w:t>
-      </w:r>
-      <w:proofErr w:type="spellStart"/>
-      <w:r>
-        <w:rPr>
-          <w:iCs/>
-          <w:color w:val="000000" w:themeColor="text1"/>
-          <w:sz w:val="24"/>
-          <w:szCs w:val="24"/>
-        </w:rPr>
-        <w:t>BufRd</w:t>
-      </w:r>
-      <w:proofErr w:type="spellEnd"/>
-      <w:r>
-        <w:rPr>
-          <w:iCs/>
-          <w:color w:val="000000" w:themeColor="text1"/>
-          <w:sz w:val="24"/>
-          <w:szCs w:val="24"/>
-        </w:rPr>
-        <w:t xml:space="preserve">, or </w:t>
-      </w:r>
-      <w:proofErr w:type="spellStart"/>
-      <w:r>
-        <w:rPr>
-          <w:iCs/>
-          <w:color w:val="000000" w:themeColor="text1"/>
-          <w:sz w:val="24"/>
-          <w:szCs w:val="24"/>
-        </w:rPr>
-        <w:t>Grainbuf</w:t>
-      </w:r>
-      <w:proofErr w:type="spellEnd"/>
-      <w:r>
-        <w:rPr>
-          <w:iCs/>
-          <w:color w:val="000000" w:themeColor="text1"/>
-          <w:sz w:val="24"/>
-          <w:szCs w:val="24"/>
-        </w:rPr>
-        <w:t>. You can “</w:t>
-      </w:r>
-      <w:proofErr w:type="spellStart"/>
-      <w:r>
-        <w:rPr>
-          <w:iCs/>
-          <w:color w:val="000000" w:themeColor="text1"/>
-          <w:sz w:val="24"/>
-          <w:szCs w:val="24"/>
-        </w:rPr>
-        <w:t>vibecode</w:t>
-      </w:r>
-      <w:proofErr w:type="spellEnd"/>
-      <w:r>
-        <w:rPr>
-          <w:iCs/>
-          <w:color w:val="000000" w:themeColor="text1"/>
-          <w:sz w:val="24"/>
-          <w:szCs w:val="24"/>
-        </w:rPr>
-        <w:t>.” The point is to get it to work somehow.</w:t>
+        <w:t>Incorporate a sampler into your favorite Synthdef or Nodeproxy tools thus far. Remove synthesis engine and replace it with Playbuf, BufRd, or Grainbuf. You can “vibecode.” The point is to get it to work somehow.</w:t>
       </w:r>
     </w:p>
     <w:p>
@@ -7361,7 +6617,6 @@
           <w:sz w:val="24"/>
           <w:szCs w:val="24"/>
         </w:rPr>
-        <w:lastRenderedPageBreak/>
         <w:t>and testing our guitar pedals</w:t>
       </w:r>
     </w:p>
@@ -7661,47 +6916,7 @@
           <w:sz w:val="24"/>
           <w:szCs w:val="24"/>
         </w:rPr>
-        <w:t xml:space="preserve">Upload and change your own code to flying fish sampler sketch. But first you need to prepare your sample, first by saving a 0.5 second wav file as an </w:t>
-      </w:r>
-      <w:proofErr w:type="gramStart"/>
-      <w:r>
-        <w:rPr>
-          <w:iCs/>
-          <w:color w:val="000000" w:themeColor="text1"/>
-          <w:sz w:val="24"/>
-          <w:szCs w:val="24"/>
-        </w:rPr>
-        <w:t>8 bit</w:t>
-      </w:r>
-      <w:proofErr w:type="gramEnd"/>
-      <w:r>
-        <w:rPr>
-          <w:iCs/>
-          <w:color w:val="000000" w:themeColor="text1"/>
-          <w:sz w:val="24"/>
-          <w:szCs w:val="24"/>
-        </w:rPr>
-        <w:t xml:space="preserve"> raw </w:t>
-      </w:r>
-      <w:proofErr w:type="gramStart"/>
-      <w:r>
-        <w:rPr>
-          <w:iCs/>
-          <w:color w:val="000000" w:themeColor="text1"/>
-          <w:sz w:val="24"/>
-          <w:szCs w:val="24"/>
-        </w:rPr>
-        <w:t>file, and</w:t>
-      </w:r>
-      <w:proofErr w:type="gramEnd"/>
-      <w:r>
-        <w:rPr>
-          <w:iCs/>
-          <w:color w:val="000000" w:themeColor="text1"/>
-          <w:sz w:val="24"/>
-          <w:szCs w:val="24"/>
-        </w:rPr>
-        <w:t xml:space="preserve"> then using the python script to encode your own digital array from that small sample. It needs to be 0.5 seconds, otherwise it will crash.</w:t>
+        <w:t>Upload and change your own code to flying fish sampler sketch. But first you need to prepare your sample, first by saving a 0.5 second wav file as an 8 bit raw file, and then using the python script to encode your own digital array from that small sample. It needs to be 0.5 seconds, otherwise it will crash.</w:t>
       </w:r>
     </w:p>
     <w:p>
@@ -7911,19 +7126,8 @@
           <w:sz w:val="24"/>
           <w:szCs w:val="24"/>
         </w:rPr>
-        <w:t xml:space="preserve">Daisy </w:t>
-      </w:r>
-      <w:proofErr w:type="spellStart"/>
-      <w:r>
-        <w:rPr>
-          <w:i/>
-          <w:color w:val="000000" w:themeColor="text1"/>
-          <w:sz w:val="24"/>
-          <w:szCs w:val="24"/>
-        </w:rPr>
-        <w:t>ElectroSmith</w:t>
-      </w:r>
-      <w:proofErr w:type="spellEnd"/>
+        <w:t>Daisy ElectroSmith</w:t>
+      </w:r>
     </w:p>
     <w:p>
       <w:pPr>
@@ -7984,27 +7188,7 @@
           <w:sz w:val="24"/>
           <w:szCs w:val="24"/>
         </w:rPr>
-        <w:t xml:space="preserve">Exploration of Daisy </w:t>
-      </w:r>
-      <w:proofErr w:type="spellStart"/>
-      <w:r>
-        <w:rPr>
-          <w:i/>
-          <w:color w:val="000000" w:themeColor="text1"/>
-          <w:sz w:val="24"/>
-          <w:szCs w:val="24"/>
-        </w:rPr>
-        <w:t>Electrosmith</w:t>
-      </w:r>
-      <w:proofErr w:type="spellEnd"/>
-      <w:r>
-        <w:rPr>
-          <w:i/>
-          <w:color w:val="000000" w:themeColor="text1"/>
-          <w:sz w:val="24"/>
-          <w:szCs w:val="24"/>
-        </w:rPr>
-        <w:t xml:space="preserve"> and </w:t>
+        <w:t xml:space="preserve">Exploration of Daisy Electrosmith and </w:t>
       </w:r>
     </w:p>
     <w:p>
@@ -8205,25 +7389,14 @@
         </w:rPr>
         <w:t xml:space="preserve">Get some sounds working on your </w:t>
       </w:r>
-      <w:proofErr w:type="spellStart"/>
-      <w:r>
-        <w:rPr>
-          <w:i/>
-          <w:color w:val="000000" w:themeColor="text1"/>
-          <w:sz w:val="24"/>
-          <w:szCs w:val="24"/>
-        </w:rPr>
-        <w:t>electrosmith</w:t>
-      </w:r>
-      <w:proofErr w:type="spellEnd"/>
-      <w:r>
-        <w:rPr>
-          <w:i/>
-          <w:color w:val="000000" w:themeColor="text1"/>
-          <w:sz w:val="24"/>
-          <w:szCs w:val="24"/>
-        </w:rPr>
-        <w:t xml:space="preserve"> </w:t>
+      <w:r>
+        <w:rPr>
+          <w:i/>
+          <w:color w:val="000000" w:themeColor="text1"/>
+          <w:sz w:val="24"/>
+          <w:szCs w:val="24"/>
+        </w:rPr>
+        <w:t xml:space="preserve">electrosmith </w:t>
       </w:r>
       <w:r>
         <w:rPr>
@@ -8529,27 +7702,7 @@
           <w:sz w:val="24"/>
           <w:szCs w:val="24"/>
         </w:rPr>
-        <w:t>The Fluid Corpus Manipulation project (</w:t>
-      </w:r>
-      <w:proofErr w:type="spellStart"/>
-      <w:r>
-        <w:rPr>
-          <w:iCs/>
-          <w:color w:val="000000" w:themeColor="text1"/>
-          <w:sz w:val="24"/>
-          <w:szCs w:val="24"/>
-        </w:rPr>
-        <w:t>FluCoMa</w:t>
-      </w:r>
-      <w:proofErr w:type="spellEnd"/>
-      <w:r>
-        <w:rPr>
-          <w:iCs/>
-          <w:color w:val="000000" w:themeColor="text1"/>
-          <w:sz w:val="24"/>
-          <w:szCs w:val="24"/>
-        </w:rPr>
-        <w:t>) instigates new musical ways of exploiting ever-growing banks of so</w:t>
+        <w:t>The Fluid Corpus Manipulation project (FluCoMa) instigates new musical ways of exploiting ever-growing banks of so</w:t>
       </w:r>
       <w:r>
         <w:rPr>
@@ -8598,27 +7751,7 @@
           <w:sz w:val="24"/>
           <w:szCs w:val="24"/>
         </w:rPr>
-        <w:t xml:space="preserve">These potent algorithms are currently partially available in closed bespoke software, or in laboratories, but not at a suitable level of modularity within the main coding environments used by the creative researchers, namely Max, Pd and </w:t>
-      </w:r>
-      <w:proofErr w:type="spellStart"/>
-      <w:r>
-        <w:rPr>
-          <w:iCs/>
-          <w:color w:val="000000" w:themeColor="text1"/>
-          <w:sz w:val="24"/>
-          <w:szCs w:val="24"/>
-        </w:rPr>
-        <w:t>SuperCollider</w:t>
-      </w:r>
-      <w:proofErr w:type="spellEnd"/>
-      <w:r>
-        <w:rPr>
-          <w:iCs/>
-          <w:color w:val="000000" w:themeColor="text1"/>
-          <w:sz w:val="24"/>
-          <w:szCs w:val="24"/>
-        </w:rPr>
-        <w:t xml:space="preserve">, to allow groundbreaking sonic research into a rich unexploited area: the manipulation of large sound corpora. Indeed, with access to, genesis of, and storage of large sound banks now commonplace, novel ways of abstracting and manipulating them are needed </w:t>
+        <w:t xml:space="preserve">These potent algorithms are currently partially available in closed bespoke software, or in laboratories, but not at a suitable level of modularity within the main coding environments used by the creative researchers, namely Max, Pd and SuperCollider, to allow groundbreaking sonic research into a rich unexploited area: the manipulation of large sound corpora. Indeed, with access to, genesis of, and storage of large sound banks now commonplace, novel ways of abstracting and manipulating them are needed </w:t>
       </w:r>
       <w:r>
         <w:rPr>

</xml_diff>

<commit_message>
time for class push
</commit_message>
<xml_diff>
--- a/Ramapo620-50_syllabus1.1docx.docx
+++ b/Ramapo620-50_syllabus1.1docx.docx
@@ -63,7 +63,6 @@
         </w:rPr>
         <w:t xml:space="preserve">0 - </w:t>
       </w:r>
-      <w:proofErr w:type="gramStart"/>
       <w:r>
         <w:rPr>
           <w:rFonts w:ascii="Arial" w:hAnsi="Arial" w:cs="Arial"/>
@@ -76,15 +75,7 @@
           <w:rFonts w:ascii="Arial" w:hAnsi="Arial" w:cs="Arial"/>
           <w:color w:val="000000" w:themeColor="text1"/>
         </w:rPr>
-        <w:t>0 :</w:t>
-      </w:r>
-      <w:proofErr w:type="gramEnd"/>
-      <w:r>
-        <w:rPr>
-          <w:rFonts w:ascii="Arial" w:hAnsi="Arial" w:cs="Arial"/>
-          <w:color w:val="000000" w:themeColor="text1"/>
-        </w:rPr>
-        <w:t xml:space="preserve"> </w:t>
+        <w:t xml:space="preserve">0 : </w:t>
       </w:r>
       <w:r>
         <w:rPr>
@@ -1397,23 +1388,7 @@
           <w:rFonts w:ascii="Arial" w:hAnsi="Arial" w:cs="Arial"/>
           <w:color w:val="000000" w:themeColor="text1"/>
         </w:rPr>
-        <w:t xml:space="preserve">Extremely powerful </w:t>
-      </w:r>
-      <w:proofErr w:type="gramStart"/>
-      <w:r>
-        <w:rPr>
-          <w:rFonts w:ascii="Arial" w:hAnsi="Arial" w:cs="Arial"/>
-          <w:color w:val="000000" w:themeColor="text1"/>
-        </w:rPr>
-        <w:t>code based</w:t>
-      </w:r>
-      <w:proofErr w:type="gramEnd"/>
-      <w:r>
-        <w:rPr>
-          <w:rFonts w:ascii="Arial" w:hAnsi="Arial" w:cs="Arial"/>
-          <w:color w:val="000000" w:themeColor="text1"/>
-        </w:rPr>
-        <w:t xml:space="preserve"> platform</w:t>
+        <w:t>Extremely powerful code based platform</w:t>
       </w:r>
     </w:p>
     <w:p>
@@ -1662,27 +1637,7 @@
           <w:color w:val="000000" w:themeColor="text1"/>
         </w:rPr>
         <w:lastRenderedPageBreak/>
-        <w:t xml:space="preserve">“Daisy is an embedded platform for music. It features everything you need for creating high fidelity audio hardware devices. Just plug in a USB cable and start making sound! Programming the Daisy is a breeze with support for </w:t>
-      </w:r>
-      <w:proofErr w:type="gramStart"/>
-      <w:r>
-        <w:rPr>
-          <w:rFonts w:ascii="Arial" w:hAnsi="Arial" w:cs="Arial"/>
-          <w:i/>
-          <w:iCs/>
-          <w:color w:val="000000" w:themeColor="text1"/>
-        </w:rPr>
-        <w:t>a number of</w:t>
-      </w:r>
-      <w:proofErr w:type="gramEnd"/>
-      <w:r>
-        <w:rPr>
-          <w:rFonts w:ascii="Arial" w:hAnsi="Arial" w:cs="Arial"/>
-          <w:i/>
-          <w:iCs/>
-          <w:color w:val="000000" w:themeColor="text1"/>
-        </w:rPr>
-        <w:t xml:space="preserve"> languages including C++, Arduino, and Max/MSP Gen~. To get started, simply upload an example program over USB, and start tweaking!”</w:t>
+        <w:t>“Daisy is an embedded platform for music. It features everything you need for creating high fidelity audio hardware devices. Just plug in a USB cable and start making sound! Programming the Daisy is a breeze with support for a number of languages including C++, Arduino, and Max/MSP Gen~. To get started, simply upload an example program over USB, and start tweaking!”</w:t>
       </w:r>
     </w:p>
     <w:p>
@@ -2024,9 +1979,9 @@
           <w:sz w:val="28"/>
           <w:szCs w:val="28"/>
         </w:rPr>
-        <w:t xml:space="preserve"> desktop, </w:t>
-      </w:r>
-      <w:proofErr w:type="gramStart"/>
+        <w:t xml:space="preserve"> desktop, Go to the link above, and click "open with </w:t>
+      </w:r>
+      <w:proofErr w:type="spellStart"/>
       <w:r>
         <w:rPr>
           <w:i w:val="0"/>
@@ -2035,9 +1990,9 @@
           <w:sz w:val="28"/>
           <w:szCs w:val="28"/>
         </w:rPr>
-        <w:t>Go</w:t>
-      </w:r>
-      <w:proofErr w:type="gramEnd"/>
+        <w:t>github</w:t>
+      </w:r>
+      <w:proofErr w:type="spellEnd"/>
       <w:r>
         <w:rPr>
           <w:i w:val="0"/>
@@ -2046,51 +2001,7 @@
           <w:sz w:val="28"/>
           <w:szCs w:val="28"/>
         </w:rPr>
-        <w:t xml:space="preserve"> to the link above, and click "open with </w:t>
-      </w:r>
-      <w:proofErr w:type="spellStart"/>
-      <w:r>
-        <w:rPr>
-          <w:i w:val="0"/>
-          <w:iCs w:val="0"/>
-          <w:color w:val="000000" w:themeColor="text1"/>
-          <w:sz w:val="28"/>
-          <w:szCs w:val="28"/>
-        </w:rPr>
-        <w:t>github</w:t>
-      </w:r>
-      <w:proofErr w:type="spellEnd"/>
-      <w:r>
-        <w:rPr>
-          <w:i w:val="0"/>
-          <w:iCs w:val="0"/>
-          <w:color w:val="000000" w:themeColor="text1"/>
-          <w:sz w:val="28"/>
-          <w:szCs w:val="28"/>
-        </w:rPr>
-        <w:t xml:space="preserve"> desktop". It will automatically download the class repository locally. You must check this every </w:t>
-      </w:r>
-      <w:proofErr w:type="gramStart"/>
-      <w:r>
-        <w:rPr>
-          <w:i w:val="0"/>
-          <w:iCs w:val="0"/>
-          <w:color w:val="000000" w:themeColor="text1"/>
-          <w:sz w:val="28"/>
-          <w:szCs w:val="28"/>
-        </w:rPr>
-        <w:t>week, and</w:t>
-      </w:r>
-      <w:proofErr w:type="gramEnd"/>
-      <w:r>
-        <w:rPr>
-          <w:i w:val="0"/>
-          <w:iCs w:val="0"/>
-          <w:color w:val="000000" w:themeColor="text1"/>
-          <w:sz w:val="28"/>
-          <w:szCs w:val="28"/>
-        </w:rPr>
-        <w:t xml:space="preserve"> see if I have pushed any changes.</w:t>
+        <w:t xml:space="preserve"> desktop". It will automatically download the class repository locally. You must check this every week, and see if I have pushed any changes.</w:t>
       </w:r>
     </w:p>
     <w:p>
@@ -2156,16 +2067,8 @@
         <w:rPr>
           <w:rFonts w:ascii="Arial" w:hAnsi="Arial" w:cs="Arial"/>
         </w:rPr>
-        <w:t xml:space="preserve">● Production Techniques: evaluate and apply advanced techniques in music production, synthesis, recording, programming, editing, and </w:t>
-      </w:r>
-      <w:proofErr w:type="gramStart"/>
-      <w:r>
-        <w:rPr>
-          <w:rFonts w:ascii="Arial" w:hAnsi="Arial" w:cs="Arial"/>
-        </w:rPr>
-        <w:t>mastering;</w:t>
-      </w:r>
-      <w:proofErr w:type="gramEnd"/>
+        <w:t>● Production Techniques: evaluate and apply advanced techniques in music production, synthesis, recording, programming, editing, and mastering;</w:t>
+      </w:r>
     </w:p>
     <w:p>
       <w:pPr>
@@ -2189,16 +2092,8 @@
         <w:rPr>
           <w:rFonts w:ascii="Arial" w:hAnsi="Arial" w:cs="Arial"/>
         </w:rPr>
-        <w:t xml:space="preserve">Theoretical Foundations: identify and interpret core theoretical foundations of </w:t>
-      </w:r>
-      <w:proofErr w:type="gramStart"/>
-      <w:r>
-        <w:rPr>
-          <w:rFonts w:ascii="Arial" w:hAnsi="Arial" w:cs="Arial"/>
-        </w:rPr>
-        <w:t>audio;</w:t>
-      </w:r>
-      <w:proofErr w:type="gramEnd"/>
+        <w:t>Theoretical Foundations: identify and interpret core theoretical foundations of audio;</w:t>
+      </w:r>
     </w:p>
     <w:p>
       <w:pPr>
@@ -2223,16 +2118,8 @@
         <w:rPr>
           <w:rFonts w:ascii="Arial" w:hAnsi="Arial" w:cs="Arial"/>
         </w:rPr>
-        <w:t xml:space="preserve">Context: analyze and articulate the importance of context in diverse practices within music </w:t>
-      </w:r>
-      <w:proofErr w:type="gramStart"/>
-      <w:r>
-        <w:rPr>
-          <w:rFonts w:ascii="Arial" w:hAnsi="Arial" w:cs="Arial"/>
-        </w:rPr>
-        <w:t>technology;</w:t>
-      </w:r>
-      <w:proofErr w:type="gramEnd"/>
+        <w:t>Context: analyze and articulate the importance of context in diverse practices within music technology;</w:t>
+      </w:r>
     </w:p>
     <w:p>
       <w:pPr>
@@ -2256,16 +2143,8 @@
         <w:rPr>
           <w:rFonts w:ascii="Arial" w:hAnsi="Arial" w:cs="Arial"/>
         </w:rPr>
-        <w:t xml:space="preserve">Musicianship and Production: integrate traditional, non-Western, and experimental approaches to musicianship and composition with music production </w:t>
-      </w:r>
-      <w:proofErr w:type="gramStart"/>
-      <w:r>
-        <w:rPr>
-          <w:rFonts w:ascii="Arial" w:hAnsi="Arial" w:cs="Arial"/>
-        </w:rPr>
-        <w:t>skills;</w:t>
-      </w:r>
-      <w:proofErr w:type="gramEnd"/>
+        <w:t>Musicianship and Production: integrate traditional, non-Western, and experimental approaches to musicianship and composition with music production skills;</w:t>
+      </w:r>
     </w:p>
     <w:p>
       <w:pPr>
@@ -3012,25 +2891,7 @@
           <w:sz w:val="24"/>
           <w:szCs w:val="24"/>
         </w:rPr>
-        <w:t xml:space="preserve"> work and experiment in class. Discussions, critiques lectures and demonstrations provide the basis for the successful completion of projects, and they are difficult to re-create outside of class. </w:t>
-      </w:r>
-      <w:proofErr w:type="gramStart"/>
-      <w:r>
-        <w:rPr>
-          <w:color w:val="000000" w:themeColor="text1"/>
-          <w:sz w:val="24"/>
-          <w:szCs w:val="24"/>
-        </w:rPr>
-        <w:t>In order to</w:t>
-      </w:r>
-      <w:proofErr w:type="gramEnd"/>
-      <w:r>
-        <w:rPr>
-          <w:color w:val="000000" w:themeColor="text1"/>
-          <w:sz w:val="24"/>
-          <w:szCs w:val="24"/>
-        </w:rPr>
-        <w:t xml:space="preserve"> participate, you must be in attendance. </w:t>
+        <w:t xml:space="preserve"> work and experiment in class. Discussions, critiques lectures and demonstrations provide the basis for the successful completion of projects, and they are difficult to re-create outside of class. In order to participate, you must be in attendance. </w:t>
       </w:r>
     </w:p>
     <w:p>
@@ -3339,18 +3200,8 @@
           <w:sz w:val="24"/>
           <w:szCs w:val="24"/>
         </w:rPr>
-        <w:t xml:space="preserve">catch </w:t>
-      </w:r>
-      <w:proofErr w:type="gramStart"/>
-      <w:r>
-        <w:rPr>
-          <w:color w:val="000000" w:themeColor="text1"/>
-          <w:sz w:val="24"/>
-          <w:szCs w:val="24"/>
-        </w:rPr>
-        <w:t>up!—</w:t>
-      </w:r>
-      <w:proofErr w:type="gramEnd"/>
+        <w:t>catch up!—</w:t>
+      </w:r>
       <w:r>
         <w:rPr>
           <w:color w:val="000000" w:themeColor="text1"/>
@@ -3601,25 +3452,7 @@
           <w:sz w:val="24"/>
           <w:szCs w:val="24"/>
         </w:rPr>
-        <w:t xml:space="preserve">You </w:t>
-      </w:r>
-      <w:proofErr w:type="gramStart"/>
-      <w:r>
-        <w:rPr>
-          <w:color w:val="000000" w:themeColor="text1"/>
-          <w:sz w:val="24"/>
-          <w:szCs w:val="24"/>
-        </w:rPr>
-        <w:t>have to</w:t>
-      </w:r>
-      <w:proofErr w:type="gramEnd"/>
-      <w:r>
-        <w:rPr>
-          <w:color w:val="000000" w:themeColor="text1"/>
-          <w:sz w:val="24"/>
-          <w:szCs w:val="24"/>
-        </w:rPr>
-        <w:t xml:space="preserve"> identify and explain a technological process.</w:t>
+        <w:t>You have to identify and explain a technological process.</w:t>
       </w:r>
     </w:p>
     <w:p>
@@ -4008,69 +3841,27 @@
         <w:rPr>
           <w:rFonts w:ascii="Arial" w:hAnsi="Arial" w:cs="Arial"/>
         </w:rPr>
-        <w:t xml:space="preserve">The use of Machine Learning tools such as ChatGPT and Claude are permitted, generally. In some </w:t>
-      </w:r>
-      <w:proofErr w:type="gramStart"/>
-      <w:r>
-        <w:rPr>
-          <w:rFonts w:ascii="Arial" w:hAnsi="Arial" w:cs="Arial"/>
-        </w:rPr>
-        <w:t>cases</w:t>
-      </w:r>
-      <w:proofErr w:type="gramEnd"/>
-      <w:r>
-        <w:rPr>
-          <w:rFonts w:ascii="Arial" w:hAnsi="Arial" w:cs="Arial"/>
-        </w:rPr>
-        <w:t xml:space="preserve"> we will explore them deliberately. In some </w:t>
-      </w:r>
-      <w:proofErr w:type="gramStart"/>
-      <w:r>
-        <w:rPr>
-          <w:rFonts w:ascii="Arial" w:hAnsi="Arial" w:cs="Arial"/>
-        </w:rPr>
-        <w:t>instances</w:t>
-      </w:r>
-      <w:proofErr w:type="gramEnd"/>
-      <w:r>
-        <w:rPr>
-          <w:rFonts w:ascii="Arial" w:hAnsi="Arial" w:cs="Arial"/>
-        </w:rPr>
-        <w:t xml:space="preserve"> you will be discouraged from using these tools. AI represents a sea change for humanity. It also represents a paradigm shift for pedagogy in digital literacy.  </w:t>
-      </w:r>
-    </w:p>
-    <w:p>
-      <w:pPr>
-        <w:rPr>
-          <w:rFonts w:ascii="Arial" w:hAnsi="Arial" w:cs="Arial"/>
-        </w:rPr>
-      </w:pPr>
-    </w:p>
-    <w:p>
-      <w:pPr>
-        <w:rPr>
-          <w:rFonts w:ascii="Arial" w:hAnsi="Arial" w:cs="Arial"/>
-        </w:rPr>
-      </w:pPr>
-      <w:r>
-        <w:rPr>
-          <w:rFonts w:ascii="Arial" w:hAnsi="Arial" w:cs="Arial"/>
-        </w:rPr>
-        <w:t xml:space="preserve">I expect you will want to use AI (ChatGPT and image generation tools, at a minimum), in this class. In fact, some assignments will require it. Learning to use AI is an emerging skill—be aware of its limits. If you provide minimum effort prompts, you will get low quality results. You will need to refine your prompts </w:t>
-      </w:r>
-      <w:proofErr w:type="gramStart"/>
-      <w:r>
-        <w:rPr>
-          <w:rFonts w:ascii="Arial" w:hAnsi="Arial" w:cs="Arial"/>
-        </w:rPr>
-        <w:t>in order to</w:t>
-      </w:r>
-      <w:proofErr w:type="gramEnd"/>
-      <w:r>
-        <w:rPr>
-          <w:rFonts w:ascii="Arial" w:hAnsi="Arial" w:cs="Arial"/>
-        </w:rPr>
-        <w:t xml:space="preserve"> get good outcomes. This will take work.</w:t>
+        <w:t xml:space="preserve">The use of Machine Learning tools such as ChatGPT and Claude are permitted, generally. In some cases we will explore them deliberately. In some instances you will be discouraged from using these tools. AI represents a sea change for humanity. It also represents a paradigm shift for pedagogy in digital literacy.  </w:t>
+      </w:r>
+    </w:p>
+    <w:p>
+      <w:pPr>
+        <w:rPr>
+          <w:rFonts w:ascii="Arial" w:hAnsi="Arial" w:cs="Arial"/>
+        </w:rPr>
+      </w:pPr>
+    </w:p>
+    <w:p>
+      <w:pPr>
+        <w:rPr>
+          <w:rFonts w:ascii="Arial" w:hAnsi="Arial" w:cs="Arial"/>
+        </w:rPr>
+      </w:pPr>
+      <w:r>
+        <w:rPr>
+          <w:rFonts w:ascii="Arial" w:hAnsi="Arial" w:cs="Arial"/>
+        </w:rPr>
+        <w:t>I expect you will want to use AI (ChatGPT and image generation tools, at a minimum), in this class. In fact, some assignments will require it. Learning to use AI is an emerging skill—be aware of its limits. If you provide minimum effort prompts, you will get low quality results. You will need to refine your prompts in order to get good outcomes. This will take work.</w:t>
       </w:r>
     </w:p>
     <w:p>
@@ -4160,146 +3951,114 @@
           <w:rFonts w:ascii="Arial" w:hAnsi="Arial" w:cs="Arial"/>
           <w:color w:val="141414"/>
         </w:rPr>
-        <w:t xml:space="preserve">Ramapo College is committed to fostering a safe, productive learning environment. Title IX and our college policy prohibit discrimination </w:t>
-      </w:r>
-      <w:proofErr w:type="gramStart"/>
-      <w:r>
+        <w:t xml:space="preserve">Ramapo College is committed to fostering a safe, productive learning environment. Title IX and our college policy prohibit discrimination on the basis of sex or gender. Sexual misconduct — including harassment, domestic and dating violence, sexual assault, and stalking are prohibited. The College encourages anyone experiencing sexual misconduct to talk to someone about what happened, so they can get the support they need and our college can respond appropriately. </w:t>
+      </w:r>
+    </w:p>
+    <w:p>
+      <w:pPr>
+        <w:rPr>
+          <w:rFonts w:ascii="Arial" w:hAnsi="Arial" w:cs="Arial"/>
+        </w:rPr>
+      </w:pPr>
+    </w:p>
+    <w:p>
+      <w:pPr>
         <w:rPr>
           <w:rFonts w:ascii="Arial" w:hAnsi="Arial" w:cs="Arial"/>
           <w:color w:val="141414"/>
         </w:rPr>
-        <w:t>on the basis of</w:t>
-      </w:r>
-      <w:proofErr w:type="gramEnd"/>
+      </w:pPr>
       <w:r>
         <w:rPr>
           <w:rFonts w:ascii="Arial" w:hAnsi="Arial" w:cs="Arial"/>
           <w:color w:val="141414"/>
         </w:rPr>
-        <w:t xml:space="preserve"> sex or gender. Sexual misconduct — including harassment, domestic and dating violence, sexual assault, and stalking are prohibited. The College encourages anyone experiencing sexual misconduct to talk to someone about what happened, so they can get the support they need and our college can respond appropriately. </w:t>
-      </w:r>
-    </w:p>
-    <w:p>
-      <w:pPr>
-        <w:rPr>
-          <w:rFonts w:ascii="Arial" w:hAnsi="Arial" w:cs="Arial"/>
-        </w:rPr>
-      </w:pPr>
-    </w:p>
-    <w:p>
-      <w:pPr>
+        <w:t xml:space="preserve">If you wish to speak confidentially about an incident of sexual misconduct, please contact the Counseling Center at </w:t>
+      </w:r>
+      <w:r>
+        <w:rPr>
+          <w:rFonts w:ascii="Arial" w:hAnsi="Arial" w:cs="Arial"/>
+          <w:color w:val="0E24B2"/>
+        </w:rPr>
+        <w:t xml:space="preserve">201-684-7522 </w:t>
+      </w:r>
+      <w:r>
         <w:rPr>
           <w:rFonts w:ascii="Arial" w:hAnsi="Arial" w:cs="Arial"/>
           <w:color w:val="141414"/>
         </w:rPr>
-      </w:pPr>
+        <w:t xml:space="preserve">or </w:t>
+      </w:r>
+      <w:r>
+        <w:rPr>
+          <w:rFonts w:ascii="Arial" w:hAnsi="Arial" w:cs="Arial"/>
+          <w:color w:val="0E24B2"/>
+        </w:rPr>
+        <w:t xml:space="preserve">201-684-6666 </w:t>
+      </w:r>
       <w:r>
         <w:rPr>
           <w:rFonts w:ascii="Arial" w:hAnsi="Arial" w:cs="Arial"/>
           <w:color w:val="141414"/>
         </w:rPr>
-        <w:t xml:space="preserve">If you wish to speak confidentially about an incident of sexual misconduct, please contact the Counseling Center at </w:t>
+        <w:t xml:space="preserve">during nights and weekends. If you wish to report sexual misconduct or have questions about policies and procedures regarding sexual misconduct, please contact the College’s Title IX Coordinator at </w:t>
       </w:r>
       <w:r>
         <w:rPr>
           <w:rFonts w:ascii="Arial" w:hAnsi="Arial" w:cs="Arial"/>
           <w:color w:val="0E24B2"/>
         </w:rPr>
-        <w:t xml:space="preserve">201-684-7522 </w:t>
+        <w:t>201-684-7540</w:t>
       </w:r>
       <w:r>
         <w:rPr>
           <w:rFonts w:ascii="Arial" w:hAnsi="Arial" w:cs="Arial"/>
           <w:color w:val="141414"/>
         </w:rPr>
-        <w:t xml:space="preserve">or </w:t>
-      </w:r>
-      <w:r>
-        <w:rPr>
-          <w:rFonts w:ascii="Arial" w:hAnsi="Arial" w:cs="Arial"/>
-          <w:color w:val="0E24B2"/>
-        </w:rPr>
-        <w:t xml:space="preserve">201-684-6666 </w:t>
-      </w:r>
+        <w:t xml:space="preserve">. </w:t>
+      </w:r>
+    </w:p>
+    <w:p>
+      <w:pPr>
+        <w:rPr>
+          <w:rFonts w:ascii="Arial" w:hAnsi="Arial" w:cs="Arial"/>
+        </w:rPr>
+      </w:pPr>
+    </w:p>
+    <w:p>
+      <w:pPr>
+        <w:rPr>
+          <w:rFonts w:ascii="Arial" w:hAnsi="Arial" w:cs="Arial"/>
+        </w:rPr>
+      </w:pPr>
       <w:r>
         <w:rPr>
           <w:rFonts w:ascii="Arial" w:hAnsi="Arial" w:cs="Arial"/>
           <w:color w:val="141414"/>
         </w:rPr>
-        <w:t xml:space="preserve">during nights and weekends. If you wish to report sexual misconduct or have questions about policies and procedures regarding sexual misconduct, please contact the College’s Title IX Coordinator at </w:t>
-      </w:r>
-      <w:r>
-        <w:rPr>
-          <w:rFonts w:ascii="Arial" w:hAnsi="Arial" w:cs="Arial"/>
-          <w:color w:val="0E24B2"/>
-        </w:rPr>
-        <w:t>201-684-7540</w:t>
-      </w:r>
-      <w:r>
+        <w:t xml:space="preserve">The College is legally obligated to investigate reports of sexual misconduct, and therefore it cannot guarantee the confidentiality of a report, but it will consider a request for confidentiality and respect it to the extent possible. </w:t>
+      </w:r>
+    </w:p>
+    <w:p>
+      <w:pPr>
+        <w:rPr>
+          <w:rFonts w:ascii="Arial" w:hAnsi="Arial" w:cs="Arial"/>
+        </w:rPr>
+      </w:pPr>
+    </w:p>
+    <w:p>
+      <w:pPr>
         <w:rPr>
           <w:rFonts w:ascii="Arial" w:hAnsi="Arial" w:cs="Arial"/>
           <w:color w:val="141414"/>
         </w:rPr>
-        <w:t xml:space="preserve">. </w:t>
-      </w:r>
-    </w:p>
-    <w:p>
-      <w:pPr>
-        <w:rPr>
-          <w:rFonts w:ascii="Arial" w:hAnsi="Arial" w:cs="Arial"/>
-        </w:rPr>
-      </w:pPr>
-    </w:p>
-    <w:p>
-      <w:pPr>
-        <w:rPr>
-          <w:rFonts w:ascii="Arial" w:hAnsi="Arial" w:cs="Arial"/>
-        </w:rPr>
       </w:pPr>
       <w:r>
         <w:rPr>
           <w:rFonts w:ascii="Arial" w:hAnsi="Arial" w:cs="Arial"/>
           <w:color w:val="141414"/>
         </w:rPr>
-        <w:t xml:space="preserve">The College is legally obligated to investigate reports of sexual misconduct, and therefore it cannot guarantee the confidentiality of a report, but it will consider a request for confidentiality and respect it to the extent possible. </w:t>
-      </w:r>
-    </w:p>
-    <w:p>
-      <w:pPr>
-        <w:rPr>
-          <w:rFonts w:ascii="Arial" w:hAnsi="Arial" w:cs="Arial"/>
-        </w:rPr>
-      </w:pPr>
-    </w:p>
-    <w:p>
-      <w:pPr>
-        <w:rPr>
-          <w:rFonts w:ascii="Arial" w:hAnsi="Arial" w:cs="Arial"/>
-          <w:color w:val="141414"/>
-        </w:rPr>
-      </w:pPr>
-      <w:r>
-        <w:rPr>
-          <w:rFonts w:ascii="Arial" w:hAnsi="Arial" w:cs="Arial"/>
-          <w:color w:val="141414"/>
-        </w:rPr>
-        <w:t xml:space="preserve">As a faculty member, I am also required by our </w:t>
-      </w:r>
-      <w:proofErr w:type="gramStart"/>
-      <w:r>
-        <w:rPr>
-          <w:rFonts w:ascii="Arial" w:hAnsi="Arial" w:cs="Arial"/>
-          <w:color w:val="141414"/>
-        </w:rPr>
-        <w:t>College</w:t>
-      </w:r>
-      <w:proofErr w:type="gramEnd"/>
-      <w:r>
-        <w:rPr>
-          <w:rFonts w:ascii="Arial" w:hAnsi="Arial" w:cs="Arial"/>
-          <w:color w:val="141414"/>
-        </w:rPr>
-        <w:t xml:space="preserve"> to report incidents of sexual misconduct and thus cannot guarantee confidentiality, but I will respect your privacy and only share the information with those who have a duty to respond. Should I become aware of an incident involving sexual misconduct, I must provide our Title IX Coordinator with relevant details such as the names of those involved in the incident. </w:t>
+        <w:t xml:space="preserve">As a faculty member, I am also required by our College to report incidents of sexual misconduct and thus cannot guarantee confidentiality, but I will respect your privacy and only share the information with those who have a duty to respond. Should I become aware of an incident involving sexual misconduct, I must provide our Title IX Coordinator with relevant details such as the names of those involved in the incident. </w:t>
       </w:r>
     </w:p>
     <w:p>
@@ -4895,19 +4654,11 @@
         </w:rPr>
         <w:t xml:space="preserve">, </w:t>
       </w:r>
-      <w:proofErr w:type="gramStart"/>
-      <w:r>
-        <w:rPr>
-          <w:rFonts w:ascii="Arial" w:hAnsi="Arial" w:cs="Arial"/>
-        </w:rPr>
-        <w:t>Modify</w:t>
-      </w:r>
-      <w:proofErr w:type="gramEnd"/>
-      <w:r>
-        <w:rPr>
-          <w:rFonts w:ascii="Arial" w:hAnsi="Arial" w:cs="Arial"/>
-        </w:rPr>
-        <w:t xml:space="preserve"> it so it sounds like something you are excited about.</w:t>
+      <w:r>
+        <w:rPr>
+          <w:rFonts w:ascii="Arial" w:hAnsi="Arial" w:cs="Arial"/>
+        </w:rPr>
+        <w:t>Modify it so it sounds like something you are excited about.</w:t>
       </w:r>
     </w:p>
     <w:p>
@@ -5677,36 +5428,16 @@
           <w:sz w:val="24"/>
           <w:szCs w:val="24"/>
         </w:rPr>
-        <w:t xml:space="preserve">Etude 2 Review: class </w:t>
-      </w:r>
-      <w:proofErr w:type="gramStart"/>
-      <w:r>
-        <w:rPr>
-          <w:iCs/>
-          <w:color w:val="000000" w:themeColor="text1"/>
-          <w:sz w:val="24"/>
-          <w:szCs w:val="24"/>
-        </w:rPr>
-        <w:t>improv!</w:t>
-      </w:r>
-      <w:r>
-        <w:rPr>
-          <w:iCs/>
-          <w:color w:val="000000" w:themeColor="text1"/>
-          <w:sz w:val="24"/>
-          <w:szCs w:val="24"/>
-        </w:rPr>
-        <w:t>...</w:t>
-      </w:r>
-      <w:proofErr w:type="gramEnd"/>
-      <w:r>
-        <w:rPr>
-          <w:iCs/>
-          <w:color w:val="000000" w:themeColor="text1"/>
-          <w:sz w:val="24"/>
-          <w:szCs w:val="24"/>
-        </w:rPr>
-        <w:t>delay class improv until week 5.</w:t>
+        <w:t>Etude 2 Review: class improv!</w:t>
+      </w:r>
+      <w:r>
+        <w:rPr>
+          <w:iCs/>
+          <w:color w:val="000000" w:themeColor="text1"/>
+          <w:sz w:val="24"/>
+          <w:szCs w:val="24"/>
+        </w:rPr>
+        <w:t>...delay class improv until week 5.</w:t>
       </w:r>
     </w:p>
     <w:p>
@@ -5814,25 +5545,14 @@
         </w:rPr>
         <w:t>Sounds should be wav</w:t>
       </w:r>
-      <w:proofErr w:type="gramStart"/>
-      <w:r>
-        <w:rPr>
-          <w:iCs/>
-          <w:color w:val="000000" w:themeColor="text1"/>
-          <w:sz w:val="24"/>
-          <w:szCs w:val="24"/>
-        </w:rPr>
-        <w:t>….can</w:t>
-      </w:r>
-      <w:proofErr w:type="gramEnd"/>
-      <w:r>
-        <w:rPr>
-          <w:iCs/>
-          <w:color w:val="000000" w:themeColor="text1"/>
-          <w:sz w:val="24"/>
-          <w:szCs w:val="24"/>
-        </w:rPr>
-        <w:t xml:space="preserve"> be stereo OR mono, up to you.</w:t>
+      <w:r>
+        <w:rPr>
+          <w:iCs/>
+          <w:color w:val="000000" w:themeColor="text1"/>
+          <w:sz w:val="24"/>
+          <w:szCs w:val="24"/>
+        </w:rPr>
+        <w:t>….can be stereo OR mono, up to you.</w:t>
       </w:r>
     </w:p>
     <w:p>
@@ -5977,27 +5697,7 @@
           <w:sz w:val="24"/>
           <w:szCs w:val="24"/>
         </w:rPr>
-        <w:t xml:space="preserve">But think about DJ culture and remember it doesn’t have to be </w:t>
-      </w:r>
-      <w:proofErr w:type="gramStart"/>
-      <w:r>
-        <w:rPr>
-          <w:iCs/>
-          <w:color w:val="000000" w:themeColor="text1"/>
-          <w:sz w:val="24"/>
-          <w:szCs w:val="24"/>
-        </w:rPr>
-        <w:t>recorded,  you</w:t>
-      </w:r>
-      <w:proofErr w:type="gramEnd"/>
-      <w:r>
-        <w:rPr>
-          <w:iCs/>
-          <w:color w:val="000000" w:themeColor="text1"/>
-          <w:sz w:val="24"/>
-          <w:szCs w:val="24"/>
-        </w:rPr>
-        <w:t xml:space="preserve"> can just be the DJ…</w:t>
+        <w:t>But think about DJ culture and remember it doesn’t have to be recorded,  you can just be the DJ…</w:t>
       </w:r>
     </w:p>
     <w:p>
@@ -6391,29 +6091,7 @@
           <w:sz w:val="24"/>
           <w:szCs w:val="24"/>
         </w:rPr>
-        <w:t xml:space="preserve">take an existing instrument you’ve made and modify </w:t>
-      </w:r>
-      <w:proofErr w:type="gramStart"/>
-      <w:r>
-        <w:rPr>
-          <w:rFonts w:ascii="Arial" w:hAnsi="Arial" w:cs="Arial"/>
-          <w:iCs/>
-          <w:color w:val="000000" w:themeColor="text1"/>
-          <w:sz w:val="24"/>
-          <w:szCs w:val="24"/>
-        </w:rPr>
-        <w:t>it</w:t>
-      </w:r>
-      <w:proofErr w:type="gramEnd"/>
-      <w:r>
-        <w:rPr>
-          <w:rFonts w:ascii="Arial" w:hAnsi="Arial" w:cs="Arial"/>
-          <w:iCs/>
-          <w:color w:val="000000" w:themeColor="text1"/>
-          <w:sz w:val="24"/>
-          <w:szCs w:val="24"/>
-        </w:rPr>
-        <w:t xml:space="preserve"> so it plays samples instead of synthesis</w:t>
+        <w:t>take an existing instrument you’ve made and modify it so it plays samples instead of synthesis</w:t>
       </w:r>
       <w:r>
         <w:rPr>
@@ -6767,27 +6445,7 @@
           <w:sz w:val="24"/>
           <w:szCs w:val="24"/>
         </w:rPr>
-        <w:t xml:space="preserve">Bring Sounds you </w:t>
-      </w:r>
-      <w:proofErr w:type="gramStart"/>
-      <w:r>
-        <w:rPr>
-          <w:bCs/>
-          <w:color w:val="000000" w:themeColor="text1"/>
-          <w:sz w:val="24"/>
-          <w:szCs w:val="24"/>
-        </w:rPr>
-        <w:t>like</w:t>
-      </w:r>
-      <w:proofErr w:type="gramEnd"/>
-      <w:r>
-        <w:rPr>
-          <w:bCs/>
-          <w:color w:val="000000" w:themeColor="text1"/>
-          <w:sz w:val="24"/>
-          <w:szCs w:val="24"/>
-        </w:rPr>
-        <w:t xml:space="preserve"> and we will improvise with computers.</w:t>
+        <w:t>Bring Sounds you like and we will improvise with computers.</w:t>
       </w:r>
     </w:p>
     <w:p>
@@ -7163,6 +6821,57 @@
           <w:szCs w:val="24"/>
         </w:rPr>
         <w:t>9/30</w:t>
+      </w:r>
+    </w:p>
+    <w:p>
+      <w:pPr>
+        <w:pStyle w:val="Normal1"/>
+        <w:rPr>
+          <w:i/>
+          <w:color w:val="000000" w:themeColor="text1"/>
+          <w:sz w:val="24"/>
+          <w:szCs w:val="24"/>
+        </w:rPr>
+      </w:pPr>
+    </w:p>
+    <w:p>
+      <w:pPr>
+        <w:pStyle w:val="Normal1"/>
+        <w:rPr>
+          <w:i/>
+          <w:color w:val="000000" w:themeColor="text1"/>
+          <w:sz w:val="24"/>
+          <w:szCs w:val="24"/>
+        </w:rPr>
+      </w:pPr>
+      <w:r>
+        <w:rPr>
+          <w:i/>
+          <w:color w:val="000000" w:themeColor="text1"/>
+          <w:sz w:val="24"/>
+          <w:szCs w:val="24"/>
+        </w:rPr>
+        <w:t xml:space="preserve">Introduction to Multichannel </w:t>
+      </w:r>
+      <w:proofErr w:type="spellStart"/>
+      <w:r>
+        <w:rPr>
+          <w:i/>
+          <w:color w:val="000000" w:themeColor="text1"/>
+          <w:sz w:val="24"/>
+          <w:szCs w:val="24"/>
+        </w:rPr>
+        <w:t>soundmaking</w:t>
+      </w:r>
+      <w:proofErr w:type="spellEnd"/>
+      <w:r>
+        <w:rPr>
+          <w:i/>
+          <w:color w:val="000000" w:themeColor="text1"/>
+          <w:sz w:val="24"/>
+          <w:szCs w:val="24"/>
+        </w:rPr>
+        <w:t xml:space="preserve"> with Supercollider.</w:t>
       </w:r>
     </w:p>
     <w:p>
@@ -7228,104 +6937,86 @@
         </w:rPr>
         <w:t xml:space="preserve"> composer</w:t>
       </w:r>
-    </w:p>
-    <w:p>
-      <w:pPr>
-        <w:pStyle w:val="Normal1"/>
-        <w:rPr>
-          <w:iCs/>
-          <w:color w:val="000000" w:themeColor="text1"/>
-          <w:sz w:val="24"/>
-          <w:szCs w:val="24"/>
-        </w:rPr>
-      </w:pPr>
-    </w:p>
-    <w:p>
-      <w:pPr>
-        <w:pStyle w:val="Normal1"/>
-        <w:rPr>
-          <w:b/>
-          <w:bCs/>
-          <w:iCs/>
-          <w:color w:val="000000" w:themeColor="text1"/>
-          <w:sz w:val="24"/>
-          <w:szCs w:val="24"/>
-        </w:rPr>
-      </w:pPr>
-      <w:r>
-        <w:rPr>
-          <w:b/>
-          <w:bCs/>
-          <w:iCs/>
-          <w:color w:val="000000" w:themeColor="text1"/>
-          <w:sz w:val="24"/>
-          <w:szCs w:val="24"/>
-        </w:rPr>
-        <w:t>Terry Riley in C</w:t>
-      </w:r>
-    </w:p>
-    <w:p>
-      <w:pPr>
-        <w:pStyle w:val="Normal1"/>
-        <w:rPr>
-          <w:iCs/>
-          <w:color w:val="000000" w:themeColor="text1"/>
-          <w:sz w:val="24"/>
-          <w:szCs w:val="24"/>
-        </w:rPr>
-      </w:pPr>
-      <w:r>
-        <w:rPr>
-          <w:iCs/>
-          <w:color w:val="000000" w:themeColor="text1"/>
-          <w:sz w:val="24"/>
-          <w:szCs w:val="24"/>
-        </w:rPr>
-        <w:t>1)</w:t>
-      </w:r>
-    </w:p>
-    <w:p>
-      <w:pPr>
-        <w:pStyle w:val="Normal1"/>
-        <w:rPr>
-          <w:iCs/>
-          <w:color w:val="000000" w:themeColor="text1"/>
-          <w:sz w:val="24"/>
-          <w:szCs w:val="24"/>
-          <w:u w:val="single"/>
-        </w:rPr>
-      </w:pPr>
-      <w:r>
-        <w:rPr>
-          <w:iCs/>
-          <w:color w:val="000000" w:themeColor="text1"/>
-          <w:sz w:val="24"/>
-          <w:szCs w:val="24"/>
-          <w:u w:val="single"/>
-        </w:rPr>
-        <w:t xml:space="preserve">Transcribe these measures into supercollider code for </w:t>
-      </w:r>
-      <w:proofErr w:type="gramStart"/>
-      <w:r>
-        <w:rPr>
-          <w:iCs/>
-          <w:color w:val="000000" w:themeColor="text1"/>
-          <w:sz w:val="24"/>
-          <w:szCs w:val="24"/>
-          <w:u w:val="single"/>
-        </w:rPr>
-        <w:t>In</w:t>
-      </w:r>
-      <w:proofErr w:type="gramEnd"/>
-      <w:r>
-        <w:rPr>
-          <w:iCs/>
-          <w:color w:val="000000" w:themeColor="text1"/>
-          <w:sz w:val="24"/>
-          <w:szCs w:val="24"/>
-          <w:u w:val="single"/>
-        </w:rPr>
-        <w:t xml:space="preserve"> C, make sure you follow the exact format.</w:t>
+      <w:r>
+        <w:rPr>
+          <w:iCs/>
+          <w:color w:val="000000" w:themeColor="text1"/>
+          <w:sz w:val="24"/>
+          <w:szCs w:val="24"/>
+        </w:rPr>
+        <w:t>…this is fun, check it out!</w:t>
+      </w:r>
+    </w:p>
+    <w:p>
+      <w:pPr>
+        <w:pStyle w:val="Normal1"/>
+        <w:rPr>
+          <w:iCs/>
+          <w:color w:val="000000" w:themeColor="text1"/>
+          <w:sz w:val="24"/>
+          <w:szCs w:val="24"/>
+        </w:rPr>
+      </w:pPr>
+    </w:p>
+    <w:p>
+      <w:pPr>
+        <w:pStyle w:val="Normal1"/>
+        <w:rPr>
+          <w:b/>
+          <w:bCs/>
+          <w:iCs/>
+          <w:color w:val="000000" w:themeColor="text1"/>
+          <w:sz w:val="24"/>
+          <w:szCs w:val="24"/>
+        </w:rPr>
+      </w:pPr>
+      <w:r>
+        <w:rPr>
+          <w:b/>
+          <w:bCs/>
+          <w:iCs/>
+          <w:color w:val="000000" w:themeColor="text1"/>
+          <w:sz w:val="24"/>
+          <w:szCs w:val="24"/>
+        </w:rPr>
+        <w:t>We play Adrian and Matteo’s Pieces today</w:t>
+      </w:r>
+    </w:p>
+    <w:p>
+      <w:pPr>
+        <w:pStyle w:val="Normal1"/>
+        <w:rPr>
+          <w:b/>
+          <w:bCs/>
+          <w:iCs/>
+          <w:color w:val="000000" w:themeColor="text1"/>
+          <w:sz w:val="24"/>
+          <w:szCs w:val="24"/>
+        </w:rPr>
+      </w:pPr>
+    </w:p>
+    <w:p>
+      <w:pPr>
+        <w:pStyle w:val="Normal1"/>
+        <w:rPr>
+          <w:b/>
+          <w:bCs/>
+          <w:iCs/>
+          <w:color w:val="000000" w:themeColor="text1"/>
+          <w:sz w:val="24"/>
+          <w:szCs w:val="24"/>
+        </w:rPr>
+      </w:pPr>
+      <w:r>
+        <w:rPr>
+          <w:b/>
+          <w:bCs/>
+          <w:iCs/>
+          <w:color w:val="000000" w:themeColor="text1"/>
+          <w:sz w:val="24"/>
+          <w:szCs w:val="24"/>
+        </w:rPr>
+        <w:t>We also play Terry Riley’s In C!</w:t>
       </w:r>
     </w:p>
     <w:p>
@@ -7354,331 +7045,18 @@
       <w:pPr>
         <w:pStyle w:val="Normal1"/>
         <w:rPr>
-          <w:iCs/>
-          <w:color w:val="000000" w:themeColor="text1"/>
-          <w:sz w:val="24"/>
-          <w:szCs w:val="24"/>
-        </w:rPr>
-      </w:pPr>
-      <w:r>
-        <w:rPr>
-          <w:iCs/>
-          <w:color w:val="000000" w:themeColor="text1"/>
-          <w:sz w:val="24"/>
-          <w:szCs w:val="24"/>
-        </w:rPr>
-        <w:t xml:space="preserve">use this to check your work and WRITE ME before Wednesday if you are stuck. </w:t>
-      </w:r>
-    </w:p>
-    <w:p>
-      <w:pPr>
-        <w:pStyle w:val="Normal1"/>
-        <w:rPr>
-          <w:iCs/>
-          <w:color w:val="000000" w:themeColor="text1"/>
-          <w:sz w:val="24"/>
-          <w:szCs w:val="24"/>
-        </w:rPr>
-      </w:pPr>
-    </w:p>
-    <w:p>
-      <w:pPr>
-        <w:pStyle w:val="Normal1"/>
-        <w:rPr>
-          <w:iCs/>
-          <w:color w:val="000000" w:themeColor="text1"/>
-          <w:sz w:val="24"/>
-          <w:szCs w:val="24"/>
-        </w:rPr>
-      </w:pPr>
-      <w:r>
-        <w:rPr>
-          <w:iCs/>
-          <w:color w:val="000000" w:themeColor="text1"/>
-          <w:sz w:val="24"/>
-          <w:szCs w:val="24"/>
-        </w:rPr>
-        <w:t>Logan — 26-34</w:t>
-      </w:r>
-    </w:p>
-    <w:p>
-      <w:pPr>
-        <w:pStyle w:val="Normal1"/>
-        <w:rPr>
-          <w:iCs/>
-          <w:color w:val="000000" w:themeColor="text1"/>
-          <w:sz w:val="24"/>
-          <w:szCs w:val="24"/>
-        </w:rPr>
-      </w:pPr>
-      <w:r>
-        <w:rPr>
-          <w:iCs/>
-          <w:color w:val="000000" w:themeColor="text1"/>
-          <w:sz w:val="24"/>
-          <w:szCs w:val="24"/>
-        </w:rPr>
-        <w:t>L</w:t>
-      </w:r>
-      <w:r>
-        <w:rPr>
-          <w:iCs/>
-          <w:color w:val="000000" w:themeColor="text1"/>
-          <w:sz w:val="24"/>
-          <w:szCs w:val="24"/>
-        </w:rPr>
-        <w:t>achlan</w:t>
-      </w:r>
-      <w:r>
-        <w:rPr>
-          <w:iCs/>
-          <w:color w:val="000000" w:themeColor="text1"/>
-          <w:sz w:val="24"/>
-          <w:szCs w:val="24"/>
-        </w:rPr>
-        <w:t xml:space="preserve"> 35-40</w:t>
-      </w:r>
-    </w:p>
-    <w:p>
-      <w:pPr>
-        <w:pStyle w:val="Normal1"/>
-        <w:rPr>
-          <w:iCs/>
-          <w:color w:val="000000" w:themeColor="text1"/>
-          <w:sz w:val="24"/>
-          <w:szCs w:val="24"/>
-        </w:rPr>
-      </w:pPr>
-      <w:r>
-        <w:rPr>
-          <w:iCs/>
-          <w:color w:val="000000" w:themeColor="text1"/>
-          <w:sz w:val="24"/>
-          <w:szCs w:val="24"/>
-        </w:rPr>
-        <w:t>Fred</w:t>
-      </w:r>
-      <w:r>
-        <w:rPr>
-          <w:iCs/>
-          <w:color w:val="000000" w:themeColor="text1"/>
-          <w:sz w:val="24"/>
-          <w:szCs w:val="24"/>
-        </w:rPr>
-        <w:t xml:space="preserve"> — 41-46</w:t>
-      </w:r>
-    </w:p>
-    <w:p>
-      <w:pPr>
-        <w:pStyle w:val="Normal1"/>
-        <w:rPr>
-          <w:iCs/>
-          <w:color w:val="000000" w:themeColor="text1"/>
-          <w:sz w:val="24"/>
-          <w:szCs w:val="24"/>
-        </w:rPr>
-      </w:pPr>
-      <w:r>
-        <w:rPr>
-          <w:iCs/>
-          <w:color w:val="000000" w:themeColor="text1"/>
-          <w:sz w:val="24"/>
-          <w:szCs w:val="24"/>
-        </w:rPr>
-        <w:t>Joh</w:t>
-      </w:r>
-      <w:r>
-        <w:rPr>
-          <w:iCs/>
-          <w:color w:val="000000" w:themeColor="text1"/>
-          <w:sz w:val="24"/>
-          <w:szCs w:val="24"/>
-        </w:rPr>
-        <w:t>n —47-53</w:t>
-      </w:r>
-    </w:p>
-    <w:p>
-      <w:pPr>
-        <w:pStyle w:val="Normal1"/>
-        <w:rPr>
-          <w:iCs/>
-          <w:color w:val="000000" w:themeColor="text1"/>
-          <w:sz w:val="24"/>
-          <w:szCs w:val="24"/>
-        </w:rPr>
-      </w:pPr>
-    </w:p>
-    <w:p>
-      <w:pPr>
-        <w:pStyle w:val="Normal1"/>
-        <w:rPr>
-          <w:iCs/>
-          <w:color w:val="000000" w:themeColor="text1"/>
-          <w:sz w:val="24"/>
-          <w:szCs w:val="24"/>
-        </w:rPr>
-      </w:pPr>
-      <w:r>
-        <w:rPr>
-          <w:iCs/>
-          <w:color w:val="000000" w:themeColor="text1"/>
-          <w:sz w:val="24"/>
-          <w:szCs w:val="24"/>
-        </w:rPr>
-        <w:t xml:space="preserve">Due Tuesday by email to Prof. </w:t>
-      </w:r>
-    </w:p>
-    <w:p>
-      <w:pPr>
-        <w:pStyle w:val="Normal1"/>
-        <w:rPr>
-          <w:iCs/>
-          <w:color w:val="000000" w:themeColor="text1"/>
-          <w:sz w:val="24"/>
-          <w:szCs w:val="24"/>
-        </w:rPr>
-      </w:pPr>
-    </w:p>
-    <w:p>
-      <w:pPr>
-        <w:pStyle w:val="Normal1"/>
-        <w:rPr>
-          <w:iCs/>
-          <w:color w:val="000000" w:themeColor="text1"/>
-          <w:sz w:val="24"/>
-          <w:szCs w:val="24"/>
-        </w:rPr>
-      </w:pPr>
-      <w:r>
-        <w:rPr>
-          <w:iCs/>
-          <w:color w:val="000000" w:themeColor="text1"/>
-          <w:sz w:val="24"/>
-          <w:szCs w:val="24"/>
-        </w:rPr>
-        <w:t>2)</w:t>
-      </w:r>
-    </w:p>
-    <w:p>
-      <w:pPr>
-        <w:pStyle w:val="Normal1"/>
-        <w:rPr>
-          <w:iCs/>
-          <w:color w:val="000000" w:themeColor="text1"/>
-          <w:sz w:val="24"/>
-          <w:szCs w:val="24"/>
-          <w:u w:val="single"/>
-        </w:rPr>
-      </w:pPr>
-      <w:r>
-        <w:rPr>
-          <w:iCs/>
-          <w:color w:val="000000" w:themeColor="text1"/>
-          <w:sz w:val="24"/>
-          <w:szCs w:val="24"/>
-          <w:u w:val="single"/>
-        </w:rPr>
-        <w:t>Design some sounds for playing this piece of music!</w:t>
-      </w:r>
-    </w:p>
-    <w:p>
-      <w:pPr>
-        <w:pStyle w:val="Normal1"/>
-        <w:rPr>
-          <w:iCs/>
-          <w:color w:val="000000" w:themeColor="text1"/>
-          <w:sz w:val="24"/>
-          <w:szCs w:val="24"/>
-        </w:rPr>
-      </w:pPr>
-      <w:proofErr w:type="spellStart"/>
-      <w:proofErr w:type="gramStart"/>
-      <w:r>
-        <w:rPr>
-          <w:iCs/>
-          <w:color w:val="000000" w:themeColor="text1"/>
-          <w:sz w:val="24"/>
-          <w:szCs w:val="24"/>
-        </w:rPr>
-        <w:t>Its</w:t>
-      </w:r>
-      <w:proofErr w:type="spellEnd"/>
-      <w:proofErr w:type="gramEnd"/>
-      <w:r>
-        <w:rPr>
-          <w:iCs/>
-          <w:color w:val="000000" w:themeColor="text1"/>
-          <w:sz w:val="24"/>
-          <w:szCs w:val="24"/>
-        </w:rPr>
-        <w:t xml:space="preserve"> up to you. You can use stuff from </w:t>
-      </w:r>
-      <w:proofErr w:type="spellStart"/>
-      <w:r>
-        <w:rPr>
-          <w:iCs/>
-          <w:color w:val="000000" w:themeColor="text1"/>
-          <w:sz w:val="24"/>
-          <w:szCs w:val="24"/>
-        </w:rPr>
-        <w:t>thre</w:t>
-      </w:r>
-      <w:proofErr w:type="spellEnd"/>
-      <w:r>
-        <w:rPr>
-          <w:iCs/>
-          <w:color w:val="000000" w:themeColor="text1"/>
-          <w:sz w:val="24"/>
-          <w:szCs w:val="24"/>
-        </w:rPr>
-        <w:t xml:space="preserve"> SCLORK </w:t>
-      </w:r>
-      <w:proofErr w:type="spellStart"/>
-      <w:r>
-        <w:rPr>
-          <w:iCs/>
-          <w:color w:val="000000" w:themeColor="text1"/>
-          <w:sz w:val="24"/>
-          <w:szCs w:val="24"/>
-        </w:rPr>
-        <w:t>respository</w:t>
-      </w:r>
-      <w:proofErr w:type="spellEnd"/>
-      <w:r>
-        <w:rPr>
-          <w:iCs/>
-          <w:color w:val="000000" w:themeColor="text1"/>
-          <w:sz w:val="24"/>
-          <w:szCs w:val="24"/>
-        </w:rPr>
-        <w:t xml:space="preserve"> and you can design your own </w:t>
-      </w:r>
-      <w:proofErr w:type="spellStart"/>
-      <w:r>
-        <w:rPr>
-          <w:iCs/>
-          <w:color w:val="000000" w:themeColor="text1"/>
-          <w:sz w:val="24"/>
-          <w:szCs w:val="24"/>
-        </w:rPr>
-        <w:t>synthdefs</w:t>
-      </w:r>
-      <w:proofErr w:type="spellEnd"/>
-      <w:r>
-        <w:rPr>
-          <w:iCs/>
-          <w:color w:val="000000" w:themeColor="text1"/>
-          <w:sz w:val="24"/>
-          <w:szCs w:val="24"/>
-        </w:rPr>
-        <w:t>. And you can hack on effects like filters and reverbs.</w:t>
-      </w:r>
-    </w:p>
-    <w:p>
-      <w:pPr>
-        <w:pStyle w:val="Normal1"/>
-        <w:rPr>
-          <w:i/>
+          <w:i/>
+          <w:color w:val="000000" w:themeColor="text1"/>
+          <w:sz w:val="24"/>
+          <w:szCs w:val="24"/>
+        </w:rPr>
+      </w:pPr>
+    </w:p>
+    <w:p>
+      <w:pPr>
+        <w:pStyle w:val="Normal1"/>
+        <w:rPr>
+          <w:iCs/>
           <w:color w:val="000000" w:themeColor="text1"/>
           <w:sz w:val="24"/>
           <w:szCs w:val="24"/>
@@ -7702,7 +7080,6 @@
           <w:sz w:val="24"/>
           <w:szCs w:val="24"/>
         </w:rPr>
-        <w:lastRenderedPageBreak/>
         <w:pict w14:anchorId="0343DABD">
           <v:rect id="_x0000_i1034" alt="" style="width:468pt;height:.05pt;mso-width-percent:0;mso-height-percent:0;mso-width-percent:0;mso-height-percent:0" o:hralign="center" o:hrstd="t" o:hr="t" fillcolor="#a0a0a0" stroked="f"/>
         </w:pict>
@@ -7763,349 +7140,6 @@
       <w:pPr>
         <w:pStyle w:val="Normal1"/>
         <w:rPr>
-          <w:b/>
-          <w:bCs/>
-          <w:iCs/>
-          <w:color w:val="000000" w:themeColor="text1"/>
-          <w:sz w:val="24"/>
-          <w:szCs w:val="24"/>
-        </w:rPr>
-      </w:pPr>
-      <w:r>
-        <w:rPr>
-          <w:b/>
-          <w:bCs/>
-          <w:iCs/>
-          <w:color w:val="000000" w:themeColor="text1"/>
-          <w:sz w:val="24"/>
-          <w:szCs w:val="24"/>
-        </w:rPr>
-        <w:t>Sampling in Supercollider and Max MSP</w:t>
-      </w:r>
-    </w:p>
-    <w:p>
-      <w:pPr>
-        <w:pStyle w:val="Normal1"/>
-        <w:rPr>
-          <w:b/>
-          <w:bCs/>
-          <w:iCs/>
-          <w:color w:val="000000" w:themeColor="text1"/>
-          <w:sz w:val="24"/>
-          <w:szCs w:val="24"/>
-        </w:rPr>
-      </w:pPr>
-      <w:r>
-        <w:rPr>
-          <w:b/>
-          <w:bCs/>
-          <w:iCs/>
-          <w:color w:val="000000" w:themeColor="text1"/>
-          <w:sz w:val="24"/>
-          <w:szCs w:val="24"/>
-        </w:rPr>
-        <w:t xml:space="preserve">Introduction to </w:t>
-      </w:r>
-      <w:proofErr w:type="spellStart"/>
-      <w:r>
-        <w:rPr>
-          <w:b/>
-          <w:bCs/>
-          <w:iCs/>
-          <w:color w:val="000000" w:themeColor="text1"/>
-          <w:sz w:val="24"/>
-          <w:szCs w:val="24"/>
-        </w:rPr>
-        <w:t>Playbuf</w:t>
-      </w:r>
-      <w:proofErr w:type="spellEnd"/>
-    </w:p>
-    <w:p>
-      <w:pPr>
-        <w:pStyle w:val="Normal1"/>
-        <w:rPr>
-          <w:b/>
-          <w:bCs/>
-          <w:iCs/>
-          <w:color w:val="000000" w:themeColor="text1"/>
-          <w:sz w:val="24"/>
-          <w:szCs w:val="24"/>
-        </w:rPr>
-      </w:pPr>
-      <w:r>
-        <w:rPr>
-          <w:b/>
-          <w:bCs/>
-          <w:iCs/>
-          <w:color w:val="000000" w:themeColor="text1"/>
-          <w:sz w:val="24"/>
-          <w:szCs w:val="24"/>
-        </w:rPr>
-        <w:t>Introduction to Granular Synthesis</w:t>
-      </w:r>
-    </w:p>
-    <w:p>
-      <w:pPr>
-        <w:pStyle w:val="Normal1"/>
-        <w:rPr>
-          <w:b/>
-          <w:bCs/>
-          <w:iCs/>
-          <w:color w:val="000000" w:themeColor="text1"/>
-          <w:sz w:val="24"/>
-          <w:szCs w:val="24"/>
-        </w:rPr>
-      </w:pPr>
-      <w:proofErr w:type="spellStart"/>
-      <w:r>
-        <w:rPr>
-          <w:b/>
-          <w:bCs/>
-          <w:iCs/>
-          <w:color w:val="000000" w:themeColor="text1"/>
-          <w:sz w:val="24"/>
-          <w:szCs w:val="24"/>
-        </w:rPr>
-        <w:t>Introduciton</w:t>
-      </w:r>
-      <w:proofErr w:type="spellEnd"/>
-      <w:r>
-        <w:rPr>
-          <w:b/>
-          <w:bCs/>
-          <w:iCs/>
-          <w:color w:val="000000" w:themeColor="text1"/>
-          <w:sz w:val="24"/>
-          <w:szCs w:val="24"/>
-        </w:rPr>
-        <w:t xml:space="preserve"> to 2</w:t>
-      </w:r>
-      <w:proofErr w:type="gramStart"/>
-      <w:r>
-        <w:rPr>
-          <w:b/>
-          <w:bCs/>
-          <w:iCs/>
-          <w:color w:val="000000" w:themeColor="text1"/>
-          <w:sz w:val="24"/>
-          <w:szCs w:val="24"/>
-        </w:rPr>
-        <w:t>d.wave</w:t>
-      </w:r>
-      <w:proofErr w:type="gramEnd"/>
-    </w:p>
-    <w:p>
-      <w:pPr>
-        <w:pStyle w:val="Normal1"/>
-        <w:rPr>
-          <w:iCs/>
-          <w:color w:val="000000" w:themeColor="text1"/>
-          <w:sz w:val="24"/>
-          <w:szCs w:val="24"/>
-        </w:rPr>
-      </w:pPr>
-      <w:r>
-        <w:rPr>
-          <w:iCs/>
-          <w:color w:val="000000" w:themeColor="text1"/>
-          <w:sz w:val="24"/>
-          <w:szCs w:val="24"/>
-        </w:rPr>
-        <w:br/>
-      </w:r>
-      <w:r>
-        <w:rPr>
-          <w:b/>
-          <w:bCs/>
-          <w:iCs/>
-          <w:color w:val="000000" w:themeColor="text1"/>
-          <w:sz w:val="24"/>
-          <w:szCs w:val="24"/>
-        </w:rPr>
-        <w:t>Etude 6</w:t>
-      </w:r>
-      <w:r>
-        <w:rPr>
-          <w:iCs/>
-          <w:color w:val="000000" w:themeColor="text1"/>
-          <w:sz w:val="24"/>
-          <w:szCs w:val="24"/>
-        </w:rPr>
-        <w:t xml:space="preserve">: </w:t>
-      </w:r>
-    </w:p>
-    <w:p>
-      <w:pPr>
-        <w:pStyle w:val="Normal1"/>
-        <w:numPr>
-          <w:ilvl w:val="0"/>
-          <w:numId w:val="38"/>
-        </w:numPr>
-        <w:rPr>
-          <w:iCs/>
-          <w:color w:val="000000" w:themeColor="text1"/>
-          <w:sz w:val="24"/>
-          <w:szCs w:val="24"/>
-        </w:rPr>
-      </w:pPr>
-      <w:r>
-        <w:rPr>
-          <w:iCs/>
-          <w:color w:val="000000" w:themeColor="text1"/>
-          <w:sz w:val="24"/>
-          <w:szCs w:val="24"/>
-        </w:rPr>
-        <w:t>make some samples. Sample an instrument, a phrase of conversation, some environmental sounds: prepare a range of samples and try them out with some of the synthesizers.</w:t>
-      </w:r>
-    </w:p>
-    <w:p>
-      <w:pPr>
-        <w:pStyle w:val="Normal1"/>
-        <w:numPr>
-          <w:ilvl w:val="0"/>
-          <w:numId w:val="38"/>
-        </w:numPr>
-        <w:rPr>
-          <w:iCs/>
-          <w:color w:val="000000" w:themeColor="text1"/>
-          <w:sz w:val="24"/>
-          <w:szCs w:val="24"/>
-        </w:rPr>
-      </w:pPr>
-      <w:r>
-        <w:rPr>
-          <w:iCs/>
-          <w:color w:val="000000" w:themeColor="text1"/>
-          <w:sz w:val="24"/>
-          <w:szCs w:val="24"/>
-        </w:rPr>
-        <w:t xml:space="preserve">Incorporate a sampler into your favorite </w:t>
-      </w:r>
-      <w:proofErr w:type="spellStart"/>
-      <w:r>
-        <w:rPr>
-          <w:iCs/>
-          <w:color w:val="000000" w:themeColor="text1"/>
-          <w:sz w:val="24"/>
-          <w:szCs w:val="24"/>
-        </w:rPr>
-        <w:t>Synthdef</w:t>
-      </w:r>
-      <w:proofErr w:type="spellEnd"/>
-      <w:r>
-        <w:rPr>
-          <w:iCs/>
-          <w:color w:val="000000" w:themeColor="text1"/>
-          <w:sz w:val="24"/>
-          <w:szCs w:val="24"/>
-        </w:rPr>
-        <w:t xml:space="preserve"> or </w:t>
-      </w:r>
-      <w:proofErr w:type="spellStart"/>
-      <w:r>
-        <w:rPr>
-          <w:iCs/>
-          <w:color w:val="000000" w:themeColor="text1"/>
-          <w:sz w:val="24"/>
-          <w:szCs w:val="24"/>
-        </w:rPr>
-        <w:t>Nodeproxy</w:t>
-      </w:r>
-      <w:proofErr w:type="spellEnd"/>
-      <w:r>
-        <w:rPr>
-          <w:iCs/>
-          <w:color w:val="000000" w:themeColor="text1"/>
-          <w:sz w:val="24"/>
-          <w:szCs w:val="24"/>
-        </w:rPr>
-        <w:t xml:space="preserve"> tools thus far. Remove synthesis engine and replace it with </w:t>
-      </w:r>
-      <w:proofErr w:type="spellStart"/>
-      <w:r>
-        <w:rPr>
-          <w:iCs/>
-          <w:color w:val="000000" w:themeColor="text1"/>
-          <w:sz w:val="24"/>
-          <w:szCs w:val="24"/>
-        </w:rPr>
-        <w:t>Playbuf</w:t>
-      </w:r>
-      <w:proofErr w:type="spellEnd"/>
-      <w:r>
-        <w:rPr>
-          <w:iCs/>
-          <w:color w:val="000000" w:themeColor="text1"/>
-          <w:sz w:val="24"/>
-          <w:szCs w:val="24"/>
-        </w:rPr>
-        <w:t xml:space="preserve">, </w:t>
-      </w:r>
-      <w:proofErr w:type="spellStart"/>
-      <w:r>
-        <w:rPr>
-          <w:iCs/>
-          <w:color w:val="000000" w:themeColor="text1"/>
-          <w:sz w:val="24"/>
-          <w:szCs w:val="24"/>
-        </w:rPr>
-        <w:t>BufRd</w:t>
-      </w:r>
-      <w:proofErr w:type="spellEnd"/>
-      <w:r>
-        <w:rPr>
-          <w:iCs/>
-          <w:color w:val="000000" w:themeColor="text1"/>
-          <w:sz w:val="24"/>
-          <w:szCs w:val="24"/>
-        </w:rPr>
-        <w:t xml:space="preserve">, or </w:t>
-      </w:r>
-      <w:proofErr w:type="spellStart"/>
-      <w:r>
-        <w:rPr>
-          <w:iCs/>
-          <w:color w:val="000000" w:themeColor="text1"/>
-          <w:sz w:val="24"/>
-          <w:szCs w:val="24"/>
-        </w:rPr>
-        <w:t>Grainbuf</w:t>
-      </w:r>
-      <w:proofErr w:type="spellEnd"/>
-      <w:r>
-        <w:rPr>
-          <w:iCs/>
-          <w:color w:val="000000" w:themeColor="text1"/>
-          <w:sz w:val="24"/>
-          <w:szCs w:val="24"/>
-        </w:rPr>
-        <w:t>. You can “</w:t>
-      </w:r>
-      <w:proofErr w:type="spellStart"/>
-      <w:r>
-        <w:rPr>
-          <w:iCs/>
-          <w:color w:val="000000" w:themeColor="text1"/>
-          <w:sz w:val="24"/>
-          <w:szCs w:val="24"/>
-        </w:rPr>
-        <w:t>vibecode</w:t>
-      </w:r>
-      <w:proofErr w:type="spellEnd"/>
-      <w:r>
-        <w:rPr>
-          <w:iCs/>
-          <w:color w:val="000000" w:themeColor="text1"/>
-          <w:sz w:val="24"/>
-          <w:szCs w:val="24"/>
-        </w:rPr>
-        <w:t>.” The point is to get it to work somehow.</w:t>
-      </w:r>
-    </w:p>
-    <w:p>
-      <w:pPr>
-        <w:pStyle w:val="Normal1"/>
-        <w:rPr>
           <w:i/>
           <w:color w:val="000000" w:themeColor="text1"/>
           <w:sz w:val="24"/>
@@ -8214,6 +7248,17 @@
       <w:pPr>
         <w:pStyle w:val="Normal1"/>
         <w:rPr>
+          <w:i/>
+          <w:color w:val="000000" w:themeColor="text1"/>
+          <w:sz w:val="24"/>
+          <w:szCs w:val="24"/>
+        </w:rPr>
+      </w:pPr>
+    </w:p>
+    <w:p>
+      <w:pPr>
+        <w:pStyle w:val="Normal1"/>
+        <w:rPr>
           <w:iCs/>
           <w:color w:val="000000" w:themeColor="text1"/>
           <w:sz w:val="24"/>
@@ -8227,6 +7272,7 @@
           <w:sz w:val="24"/>
           <w:szCs w:val="24"/>
         </w:rPr>
+        <w:lastRenderedPageBreak/>
         <w:pict w14:anchorId="2274D626">
           <v:rect id="_x0000_i1033" alt="" style="width:468pt;height:.05pt;mso-width-percent:0;mso-height-percent:0;mso-width-percent:0;mso-height-percent:0" o:hralign="center" o:hrstd="t" o:hr="t" fillcolor="#a0a0a0" stroked="f"/>
         </w:pict>
@@ -8248,14 +7294,18 @@
       <w:pPr>
         <w:pStyle w:val="Normal1"/>
         <w:rPr>
-          <w:i/>
-          <w:color w:val="000000" w:themeColor="text1"/>
-          <w:sz w:val="24"/>
-          <w:szCs w:val="24"/>
-        </w:rPr>
-      </w:pPr>
-      <w:r>
-        <w:rPr>
+          <w:b/>
+          <w:bCs/>
+          <w:i/>
+          <w:color w:val="000000" w:themeColor="text1"/>
+          <w:sz w:val="24"/>
+          <w:szCs w:val="24"/>
+        </w:rPr>
+      </w:pPr>
+      <w:r>
+        <w:rPr>
+          <w:b/>
+          <w:bCs/>
           <w:i/>
           <w:color w:val="000000" w:themeColor="text1"/>
           <w:sz w:val="24"/>
@@ -8265,6 +7315,8 @@
       </w:r>
       <w:r>
         <w:rPr>
+          <w:b/>
+          <w:bCs/>
           <w:i/>
           <w:color w:val="000000" w:themeColor="text1"/>
           <w:sz w:val="24"/>
@@ -8274,6 +7326,8 @@
       </w:r>
       <w:r>
         <w:rPr>
+          <w:b/>
+          <w:bCs/>
           <w:i/>
           <w:color w:val="000000" w:themeColor="text1"/>
           <w:sz w:val="24"/>
@@ -8297,282 +7351,56 @@
       <w:pPr>
         <w:pStyle w:val="Normal1"/>
         <w:rPr>
-          <w:b/>
-          <w:bCs/>
-          <w:i/>
-          <w:color w:val="000000" w:themeColor="text1"/>
-          <w:sz w:val="24"/>
-          <w:szCs w:val="24"/>
-        </w:rPr>
-      </w:pPr>
-    </w:p>
-    <w:p>
-      <w:pPr>
-        <w:pStyle w:val="Normal1"/>
-        <w:rPr>
-          <w:b/>
-          <w:bCs/>
-          <w:i/>
-          <w:color w:val="000000" w:themeColor="text1"/>
-          <w:sz w:val="24"/>
-          <w:szCs w:val="24"/>
-        </w:rPr>
-      </w:pPr>
-      <w:r>
-        <w:rPr>
-          <w:b/>
-          <w:bCs/>
-          <w:i/>
-          <w:color w:val="000000" w:themeColor="text1"/>
-          <w:sz w:val="24"/>
-          <w:szCs w:val="24"/>
-        </w:rPr>
-        <w:t>First batch of Artist Presentations</w:t>
-      </w:r>
-    </w:p>
-    <w:p>
-      <w:pPr>
-        <w:pStyle w:val="Normal1"/>
-        <w:rPr>
-          <w:i/>
-          <w:color w:val="000000" w:themeColor="text1"/>
-          <w:sz w:val="24"/>
-          <w:szCs w:val="24"/>
-        </w:rPr>
-      </w:pPr>
-    </w:p>
-    <w:p>
-      <w:pPr>
-        <w:pStyle w:val="Normal1"/>
-        <w:rPr>
-          <w:i/>
-          <w:color w:val="000000" w:themeColor="text1"/>
-          <w:sz w:val="24"/>
-          <w:szCs w:val="24"/>
-        </w:rPr>
-      </w:pPr>
-      <w:r>
-        <w:rPr>
-          <w:i/>
-          <w:color w:val="000000" w:themeColor="text1"/>
-          <w:sz w:val="24"/>
-          <w:szCs w:val="24"/>
-        </w:rPr>
-        <w:t>Vibe Coding</w:t>
-      </w:r>
-      <w:r>
-        <w:rPr>
-          <w:i/>
-          <w:color w:val="000000" w:themeColor="text1"/>
-          <w:sz w:val="24"/>
-          <w:szCs w:val="24"/>
-        </w:rPr>
-        <w:t xml:space="preserve"> with Arduino and DSP</w:t>
-      </w:r>
-    </w:p>
-    <w:p>
-      <w:pPr>
-        <w:pStyle w:val="Normal1"/>
-        <w:rPr>
-          <w:i/>
-          <w:color w:val="000000" w:themeColor="text1"/>
-          <w:sz w:val="24"/>
-          <w:szCs w:val="24"/>
-        </w:rPr>
-      </w:pPr>
-    </w:p>
-    <w:p>
-      <w:pPr>
-        <w:pStyle w:val="Normal1"/>
-        <w:rPr>
-          <w:i/>
-          <w:color w:val="000000" w:themeColor="text1"/>
-          <w:sz w:val="24"/>
-          <w:szCs w:val="24"/>
-        </w:rPr>
-      </w:pPr>
-      <w:r>
-        <w:rPr>
-          <w:i/>
-          <w:color w:val="000000" w:themeColor="text1"/>
-          <w:sz w:val="24"/>
-          <w:szCs w:val="24"/>
-        </w:rPr>
-        <w:t xml:space="preserve">Getting different </w:t>
-      </w:r>
-      <w:r>
-        <w:rPr>
-          <w:i/>
-          <w:color w:val="000000" w:themeColor="text1"/>
-          <w:sz w:val="24"/>
-          <w:szCs w:val="24"/>
-        </w:rPr>
-        <w:t>Synthesis Algorithms and DSP to work on 8bit Arduino</w:t>
-      </w:r>
-    </w:p>
-    <w:p>
-      <w:pPr>
-        <w:pStyle w:val="Normal1"/>
-        <w:rPr>
-          <w:i/>
-          <w:color w:val="000000" w:themeColor="text1"/>
-          <w:sz w:val="24"/>
-          <w:szCs w:val="24"/>
-        </w:rPr>
-      </w:pPr>
-    </w:p>
-    <w:p>
-      <w:pPr>
-        <w:pStyle w:val="Normal1"/>
-        <w:rPr>
-          <w:i/>
-          <w:color w:val="000000" w:themeColor="text1"/>
-          <w:sz w:val="24"/>
-          <w:szCs w:val="24"/>
-        </w:rPr>
-      </w:pPr>
-      <w:hyperlink r:id="rId26" w:history="1">
-        <w:r>
-          <w:rPr>
-            <w:rStyle w:val="Hyperlink"/>
-            <w:i/>
-            <w:sz w:val="24"/>
-            <w:szCs w:val="24"/>
-          </w:rPr>
-          <w:t>https://github.com/dfict/bigg_fish</w:t>
-        </w:r>
-      </w:hyperlink>
-    </w:p>
-    <w:p>
-      <w:pPr>
-        <w:pStyle w:val="Normal1"/>
-        <w:rPr>
-          <w:i/>
-          <w:color w:val="000000" w:themeColor="text1"/>
-          <w:sz w:val="24"/>
-          <w:szCs w:val="24"/>
-        </w:rPr>
-      </w:pPr>
-    </w:p>
-    <w:p>
-      <w:pPr>
-        <w:pStyle w:val="Normal1"/>
-        <w:rPr>
-          <w:i/>
-          <w:color w:val="000000" w:themeColor="text1"/>
-          <w:sz w:val="24"/>
-          <w:szCs w:val="24"/>
-        </w:rPr>
-      </w:pPr>
-      <w:r>
-        <w:rPr>
-          <w:i/>
-          <w:color w:val="000000" w:themeColor="text1"/>
-          <w:sz w:val="24"/>
-          <w:szCs w:val="24"/>
-        </w:rPr>
-        <w:t>Etude 8:</w:t>
-      </w:r>
-    </w:p>
-    <w:p>
-      <w:pPr>
-        <w:pStyle w:val="Normal1"/>
-        <w:numPr>
-          <w:ilvl w:val="0"/>
-          <w:numId w:val="41"/>
-        </w:numPr>
-        <w:rPr>
-          <w:iCs/>
-          <w:color w:val="000000" w:themeColor="text1"/>
-          <w:sz w:val="24"/>
-          <w:szCs w:val="24"/>
-        </w:rPr>
-      </w:pPr>
-      <w:r>
-        <w:rPr>
-          <w:iCs/>
-          <w:color w:val="000000" w:themeColor="text1"/>
-          <w:sz w:val="24"/>
-          <w:szCs w:val="24"/>
-        </w:rPr>
-        <w:t xml:space="preserve">Upload and change your own code to flying fish sampler sketch. But first you need to prepare your sample, first by saving a 0.5 second wav file as an </w:t>
-      </w:r>
-      <w:proofErr w:type="gramStart"/>
-      <w:r>
-        <w:rPr>
-          <w:iCs/>
-          <w:color w:val="000000" w:themeColor="text1"/>
-          <w:sz w:val="24"/>
-          <w:szCs w:val="24"/>
-        </w:rPr>
-        <w:t>8 bit</w:t>
-      </w:r>
-      <w:proofErr w:type="gramEnd"/>
-      <w:r>
-        <w:rPr>
-          <w:iCs/>
-          <w:color w:val="000000" w:themeColor="text1"/>
-          <w:sz w:val="24"/>
-          <w:szCs w:val="24"/>
-        </w:rPr>
-        <w:t xml:space="preserve"> raw </w:t>
-      </w:r>
-      <w:proofErr w:type="gramStart"/>
-      <w:r>
-        <w:rPr>
-          <w:iCs/>
-          <w:color w:val="000000" w:themeColor="text1"/>
-          <w:sz w:val="24"/>
-          <w:szCs w:val="24"/>
-        </w:rPr>
-        <w:t>file, and</w:t>
-      </w:r>
-      <w:proofErr w:type="gramEnd"/>
-      <w:r>
-        <w:rPr>
-          <w:iCs/>
-          <w:color w:val="000000" w:themeColor="text1"/>
-          <w:sz w:val="24"/>
-          <w:szCs w:val="24"/>
-        </w:rPr>
-        <w:t xml:space="preserve"> then using the python script to encode your own digital array from that small sample. It needs to be 0.5 seconds, otherwise it will crash.</w:t>
-      </w:r>
-    </w:p>
-    <w:p>
-      <w:pPr>
-        <w:pStyle w:val="Normal1"/>
-        <w:numPr>
-          <w:ilvl w:val="0"/>
-          <w:numId w:val="40"/>
-        </w:numPr>
-        <w:rPr>
-          <w:iCs/>
-          <w:color w:val="000000" w:themeColor="text1"/>
-          <w:sz w:val="24"/>
-          <w:szCs w:val="24"/>
-        </w:rPr>
-      </w:pPr>
-      <w:r>
-        <w:rPr>
-          <w:iCs/>
-          <w:color w:val="000000" w:themeColor="text1"/>
-          <w:sz w:val="24"/>
-          <w:szCs w:val="24"/>
-        </w:rPr>
-        <w:lastRenderedPageBreak/>
-        <w:t>or use one of the other DSP examples to make whatever sounds you’d like for the instrument. Add a new sketch and make it your own.</w:t>
-      </w:r>
-    </w:p>
-    <w:p>
-      <w:pPr>
-        <w:pStyle w:val="Normal1"/>
-        <w:rPr>
-          <w:i/>
-          <w:color w:val="000000" w:themeColor="text1"/>
-          <w:sz w:val="24"/>
-          <w:szCs w:val="24"/>
-        </w:rPr>
-      </w:pPr>
+          <w:i/>
+          <w:color w:val="000000" w:themeColor="text1"/>
+          <w:sz w:val="24"/>
+          <w:szCs w:val="24"/>
+        </w:rPr>
+      </w:pPr>
+      <w:r>
+        <w:rPr>
+          <w:i/>
+          <w:color w:val="000000" w:themeColor="text1"/>
+          <w:sz w:val="24"/>
+          <w:szCs w:val="24"/>
+        </w:rPr>
+        <w:t>First batch of artist presentations</w:t>
+      </w:r>
+    </w:p>
+    <w:p>
+      <w:pPr>
+        <w:pStyle w:val="Normal1"/>
+        <w:rPr>
+          <w:b/>
+          <w:bCs/>
+          <w:i/>
+          <w:color w:val="000000" w:themeColor="text1"/>
+          <w:sz w:val="24"/>
+          <w:szCs w:val="24"/>
+        </w:rPr>
+      </w:pPr>
+    </w:p>
+    <w:p>
+      <w:pPr>
+        <w:pStyle w:val="Normal1"/>
+        <w:rPr>
+          <w:i/>
+          <w:color w:val="000000" w:themeColor="text1"/>
+          <w:sz w:val="24"/>
+          <w:szCs w:val="24"/>
+        </w:rPr>
+      </w:pPr>
+      <w:r>
+        <w:rPr>
+          <w:b/>
+          <w:bCs/>
+          <w:i/>
+          <w:color w:val="000000" w:themeColor="text1"/>
+          <w:sz w:val="24"/>
+          <w:szCs w:val="24"/>
+        </w:rPr>
+        <w:t>Class online</w:t>
+      </w:r>
     </w:p>
     <w:p>
       <w:pPr>
@@ -8770,7 +7598,7 @@
           <w:szCs w:val="24"/>
         </w:rPr>
       </w:pPr>
-      <w:hyperlink r:id="rId27" w:history="1">
+      <w:hyperlink r:id="rId26" w:history="1">
         <w:r>
           <w:rPr>
             <w:rStyle w:val="Hyperlink"/>
@@ -8898,7 +7726,7 @@
                     </pic:cNvPicPr>
                   </pic:nvPicPr>
                   <pic:blipFill>
-                    <a:blip r:embed="rId28">
+                    <a:blip r:embed="rId27">
                       <a:extLst>
                         <a:ext uri="{28A0092B-C50C-407E-A947-70E740481C1C}">
                           <a14:useLocalDpi xmlns:a14="http://schemas.microsoft.com/office/drawing/2010/main" val="0"/>
@@ -8954,7 +7782,7 @@
                     </pic:cNvPicPr>
                   </pic:nvPicPr>
                   <pic:blipFill>
-                    <a:blip r:embed="rId29">
+                    <a:blip r:embed="rId28">
                       <a:extLst>
                         <a:ext uri="{28A0092B-C50C-407E-A947-70E740481C1C}">
                           <a14:useLocalDpi xmlns:a14="http://schemas.microsoft.com/office/drawing/2010/main" val="0"/>
@@ -9220,6 +8048,7 @@
           <w:sz w:val="24"/>
           <w:szCs w:val="24"/>
         </w:rPr>
+        <w:lastRenderedPageBreak/>
         <w:t>Final Project Proposal.</w:t>
       </w:r>
     </w:p>
@@ -9273,7 +8102,6 @@
           <w:sz w:val="24"/>
           <w:szCs w:val="24"/>
         </w:rPr>
-        <w:lastRenderedPageBreak/>
         <w:t>Class 11 Wednesday 11/</w:t>
       </w:r>
       <w:r>
@@ -9333,7 +8161,7 @@
           <w:szCs w:val="24"/>
         </w:rPr>
       </w:pPr>
-      <w:hyperlink r:id="rId30" w:history="1">
+      <w:hyperlink r:id="rId29" w:history="1">
         <w:r>
           <w:rPr>
             <w:rStyle w:val="Hyperlink"/>
@@ -9984,6 +8812,7 @@
           <w:sz w:val="24"/>
           <w:szCs w:val="24"/>
         </w:rPr>
+        <w:lastRenderedPageBreak/>
         <w:t>Final Exam</w:t>
       </w:r>
     </w:p>
@@ -10009,12 +8838,12 @@
       </w:pPr>
     </w:p>
     <w:sectPr>
-      <w:headerReference w:type="even" r:id="rId31"/>
-      <w:headerReference w:type="default" r:id="rId32"/>
-      <w:footerReference w:type="even" r:id="rId33"/>
-      <w:footerReference w:type="default" r:id="rId34"/>
-      <w:headerReference w:type="first" r:id="rId35"/>
-      <w:footerReference w:type="first" r:id="rId36"/>
+      <w:headerReference w:type="even" r:id="rId30"/>
+      <w:headerReference w:type="default" r:id="rId31"/>
+      <w:footerReference w:type="even" r:id="rId32"/>
+      <w:footerReference w:type="default" r:id="rId33"/>
+      <w:headerReference w:type="first" r:id="rId34"/>
+      <w:footerReference w:type="first" r:id="rId35"/>
       <w:type w:val="continuous"/>
       <w:pgSz w:w="12240" w:h="15840"/>
       <w:pgMar w:top="1440" w:right="1440" w:bottom="1440" w:left="1440" w:header="720" w:footer="720" w:gutter="0"/>

</xml_diff>